<commit_message>
DPS: zonas de proteção, divisão da Iimp, linhas de sinal e desenhos de ligação
- Classe por zona de proteção contra raios (NBR 5419-4), método também
  adotado pela Clamper: ZPR 0->1 na entrada, 1->2 nos quadros, 2->3 classe III
- Iimp com SPDA = Ip x 0,5 / (serviços x condutores) (NBR 5419-1, Anexo E)
- Retaguarda pelo curto suportável do desligador interno (prática Clamper)
- Linhas de sinal na entrada (par metálico, rede de dados, coaxial) com DPS
  ligado ao BEP; DPS obrigatório no quadro de entrada
- Esquema de conexão 1, 2 ou 3 (Figura 13) por quadro
- Desenhos: ligação de cada quadro (T com F2 ou V, cota a + b <= 0,5 m),
  zonas de proteção com a cascata e galeria das formas de ligação, na aba
  DPS, nas tabelas de referência e na memória
- README e testes atualizados

Co-Authored-By: Claude Opus 5.5 <noreply@anthropic.com>
Claude-Session: https://claude.ai/code/session_01E4Px4gvzC9MkKBX1rn21ys
</commit_message>
<xml_diff>
--- a/exemplo/memoria-dps-residencia-unifamiliar-exemplo-r00.docx
+++ b/exemplo/memoria-dps-residencia-unifamiliar-exemplo-r00.docx
@@ -1394,7 +1394,7 @@
           <w:szCs w:val="19"/>
           <w:rFonts w:ascii="Calibri" w:cs="Calibri" w:eastAsia="Calibri" w:hAnsi="Calibri"/>
         </w:rPr>
-        <w:t xml:space="preserve">Classe: I+II no ponto de entrada quando a estrutura tem SPDA (descargas diretas); II nos quadros de distribuição (descargas indiretas e manobras); III junto a equipamentos sensíveis quando o nível de proteção efetivo ou a distância excedem o que o DPS do quadro protege.</w:t>
+        <w:t xml:space="preserve">Classe pelas zonas de proteção contra raios (NBR 5419-4): na fronteira ZPR 0 → 1 (entrada da linha), DPS classe I+II quando a estrutura tem SPDA e classe II sem SPDA; na fronteira ZPR 1 → 2 (quadros de distribuição), classe II; na ZPR 2 → 3 (junto ao equipamento sensível), classe III — critério também adotado pelos fabricantes (Clamper, Finder, Siemens).</w:t>
       </w:r>
     </w:p>
     <w:p>
@@ -1448,7 +1448,7 @@
           <w:szCs w:val="19"/>
           <w:rFonts w:ascii="Calibri" w:cs="Calibri" w:eastAsia="Calibri" w:hAnsi="Calibri"/>
         </w:rPr>
-        <w:t xml:space="preserve">Corrente de impulso dos DPS classe I+II: Iimp ≥ 12,5 kA por modo (10/350 µs) ou o valor do nível de proteção do SPDA; na ligação n+1, o centelhador N–PE com a soma das correntes. Centelhadores: corrente subsequente interrompida Ifi ≥ curto-circuito presumido; N–PE com Ifi ≥ 100 A (NBR 5410).</w:t>
+        <w:t xml:space="preserve">Corrente de impulso dos DPS classe I+II: metade da corrente de pico do nível de proteção do SPDA vai para o aterramento e a outra metade se divide entre os serviços metálicos que entram na estrutura e entre os condutores de cada um — Iimp = Ip × 0,5 / (n serviços × m condutores) (NBR 5419-1, Anexo E), com mínimo de 12,5 kA por modo; na ligação n+1, o centelhador N–PE com a soma das correntes. Centelhadores: corrente subsequente interrompida Ifi ≥ curto-circuito presumido; N–PE com Ifi ≥ 100 A (NBR 5410).</w:t>
       </w:r>
     </w:p>
     <w:p>
@@ -1520,7 +1520,7 @@
           <w:szCs w:val="19"/>
           <w:rFonts w:ascii="Calibri" w:cs="Calibri" w:eastAsia="Calibri" w:hAnsi="Calibri"/>
         </w:rPr>
-        <w:t xml:space="preserve">Proteção de retaguarda: a corrente máxima indicada pelo fabricante; se a proteção a montante for maior, fusível ou disjuntor dedicado no ramal do DPS com o valor indicado — valores menores podem romper com surtos abaixo dos nominais do DPS. Isccr do DPS ≥ curto-circuito presumido no quadro.</w:t>
+        <w:t xml:space="preserve">Proteção de retaguarda: a corrente máxima indicada pelo fabricante; se a proteção a montante for maior (catálogo Siemens) ou se o curto-circuito presumido passar do suportado pelo desligador interno do DPS (catálogo Clamper), fusível ou disjuntor dedicado por fase no ramal do DPS com o valor indicado — valores menores podem romper com surtos abaixo dos nominais do DPS. Isccr do DPS com a retaguarda ≥ curto-circuito presumido no quadro.</w:t>
       </w:r>
     </w:p>
     <w:p>
@@ -1557,6 +1557,24 @@
           <w:rFonts w:ascii="Calibri" w:cs="Calibri" w:eastAsia="Calibri" w:hAnsi="Calibri"/>
         </w:rPr>
         <w:t xml:space="preserve">DPS a jusante de DR: o DR, instantâneo ou temporizado, deve ter imunidade a correntes de surto de no mínimo 3 kA (8/20 µs); DR tipo S recomendado.</w:t>
+      </w:r>
+    </w:p>
+    <w:p>
+      <w:pPr>
+        <w:pStyle w:val="ListParagraph"/>
+        <w:numPr>
+          <w:ilvl w:val="0"/>
+          <w:numId w:val="1"/>
+        </w:numPr>
+        <w:spacing w:after="40"/>
+      </w:pPr>
+      <w:r>
+        <w:rPr>
+          <w:sz w:val="19"/>
+          <w:szCs w:val="19"/>
+          <w:rFonts w:ascii="Calibri" w:cs="Calibri" w:eastAsia="Calibri" w:hAnsi="Calibri"/>
+        </w:rPr>
+        <w:t xml:space="preserve">Linhas de sinal: toda linha externa de sinal (telefonia, dados, vídeo, antena) recebe DPS no ponto de entrada da edificação, ligado ao BEP (ou ao BEL mais próximo nas linhas que vão a outras edificações ou antenas); componentes de sinal na entrada suportam no mínimo 1,5 kV de impulso (NBR 5410, nota da Tabela 31). Todas as linhas e tubulações metálicas que entram na edificação são equipotencializadas no BEP, diretamente ou por DPS.</w:t>
       </w:r>
     </w:p>
     <w:p>
@@ -1681,7 +1699,7 @@
                 <w:szCs w:val="17"/>
                 <w:rFonts w:ascii="Calibri" w:cs="Calibri" w:eastAsia="Calibri" w:hAnsi="Calibri"/>
               </w:rPr>
-              <w:t xml:space="preserve">Ponto de entrada (origem)</w:t>
+              <w:t xml:space="preserve">Ponto de entrada (origem) — fronteira ZPR 0 → 1</w:t>
             </w:r>
           </w:p>
         </w:tc>
@@ -2448,7 +2466,7 @@
           <w:szCs w:val="19"/>
           <w:rFonts w:ascii="Calibri" w:cs="Calibri" w:eastAsia="Calibri" w:hAnsi="Calibri"/>
         </w:rPr>
-        <w:t xml:space="preserve">✓ Iimp = 12,50 kA (10/350 µs) por modo ≥ 12,50 kA (NP III do SPDA)</w:t>
+        <w:t xml:space="preserve">✓ Iimp = 12,50 kA (10/350 µs) por modo ≥ 12,50 kA — NP III: 100 kA × 0,5 / (1 serviço × 4 condutores) = 12,50 kA (NBR 5419-1, Anexo E)</w:t>
       </w:r>
     </w:p>
     <w:p>
@@ -2549,6 +2567,66 @@
           <w:rFonts w:ascii="Calibri" w:cs="Calibri" w:eastAsia="Calibri" w:hAnsi="Calibri"/>
         </w:rPr>
         <w:t xml:space="preserve">Informe a corrente de curto-circuito suportável do DPS (Isccr) para comparar com a do quadro.</w:t>
+      </w:r>
+    </w:p>
+    <w:p>
+      <w:pPr>
+        <w:keepNext/>
+        <w:spacing w:before="60" w:after="20"/>
+      </w:pPr>
+      <w:r>
+        <w:drawing>
+          <wp:inline distT="0" distB="0" distL="0" distR="0">
+            <wp:extent cx="4448175" cy="2781300"/>
+            <wp:effectExtent t="0" r="0" b="0" l="0"/>
+            <wp:docPr id="1" name="" descr="" title=""/>
+            <wp:cNvGraphicFramePr>
+              <a:graphicFrameLocks xmlns:a="http://schemas.openxmlformats.org/drawingml/2006/main" noChangeAspect="1"/>
+            </wp:cNvGraphicFramePr>
+            <a:graphic xmlns:a="http://schemas.openxmlformats.org/drawingml/2006/main">
+              <a:graphicData uri="http://schemas.openxmlformats.org/drawingml/2006/picture">
+                <pic:pic xmlns:pic="http://schemas.openxmlformats.org/drawingml/2006/picture">
+                  <pic:nvPicPr>
+                    <pic:cNvPr id="0" name="" descr=""/>
+                    <pic:cNvPicPr>
+                      <a:picLocks noChangeAspect="1" noChangeArrowheads="1"/>
+                    </pic:cNvPicPr>
+                  </pic:nvPicPr>
+                  <pic:blipFill>
+                    <a:blip r:embed="rId8" cstate="none"/>
+                    <a:srcRect/>
+                    <a:stretch>
+                      <a:fillRect/>
+                    </a:stretch>
+                  </pic:blipFill>
+                  <pic:spPr bwMode="auto">
+                    <a:xfrm>
+                      <a:off x="0" y="0"/>
+                      <a:ext cx="4448175" cy="2781300"/>
+                    </a:xfrm>
+                    <a:prstGeom prst="rect">
+                      <a:avLst/>
+                    </a:prstGeom>
+                  </pic:spPr>
+                </pic:pic>
+              </a:graphicData>
+            </a:graphic>
+          </wp:inline>
+        </w:drawing>
+      </w:r>
+    </w:p>
+    <w:p>
+      <w:pPr>
+        <w:spacing w:after="100" w:before="0"/>
+      </w:pPr>
+      <w:r>
+        <w:rPr>
+          <w:color w:val="56606A"/>
+          <w:sz w:val="16"/>
+          <w:szCs w:val="16"/>
+          <w:rFonts w:ascii="Calibri" w:cs="Calibri" w:eastAsia="Calibri" w:hAnsi="Calibri"/>
+        </w:rPr>
+        <w:t xml:space="preserve">Esquema de ligação dos DPS do QM: esquema de conexão 2 (figura 13), ligação em T (paralelo); condutores de ligação de 16 mm².</w:t>
       </w:r>
     </w:p>
     <w:p>
@@ -2652,7 +2730,7 @@
                 <w:szCs w:val="17"/>
                 <w:rFonts w:ascii="Calibri" w:cs="Calibri" w:eastAsia="Calibri" w:hAnsi="Calibri"/>
               </w:rPr>
-              <w:t xml:space="preserve">Quadro de distribuição</w:t>
+              <w:t xml:space="preserve">Quadro de distribuição — fronteira ZPR 1 → 2</w:t>
             </w:r>
           </w:p>
         </w:tc>
@@ -3406,6 +3484,66 @@
           <w:rFonts w:ascii="Calibri" w:cs="Calibri" w:eastAsia="Calibri" w:hAnsi="Calibri"/>
         </w:rPr>
         <w:t xml:space="preserve">✓ Coordenação com o DPS do QM: 12,0 m de cabo entre os estágios (≥ 10 m)</w:t>
+      </w:r>
+    </w:p>
+    <w:p>
+      <w:pPr>
+        <w:keepNext/>
+        <w:spacing w:before="60" w:after="20"/>
+      </w:pPr>
+      <w:r>
+        <w:drawing>
+          <wp:inline distT="0" distB="0" distL="0" distR="0">
+            <wp:extent cx="4448175" cy="2781300"/>
+            <wp:effectExtent t="0" r="0" b="0" l="0"/>
+            <wp:docPr id="1" name="" descr="" title=""/>
+            <wp:cNvGraphicFramePr>
+              <a:graphicFrameLocks xmlns:a="http://schemas.openxmlformats.org/drawingml/2006/main" noChangeAspect="1"/>
+            </wp:cNvGraphicFramePr>
+            <a:graphic xmlns:a="http://schemas.openxmlformats.org/drawingml/2006/main">
+              <a:graphicData uri="http://schemas.openxmlformats.org/drawingml/2006/picture">
+                <pic:pic xmlns:pic="http://schemas.openxmlformats.org/drawingml/2006/picture">
+                  <pic:nvPicPr>
+                    <pic:cNvPr id="0" name="" descr=""/>
+                    <pic:cNvPicPr>
+                      <a:picLocks noChangeAspect="1" noChangeArrowheads="1"/>
+                    </pic:cNvPicPr>
+                  </pic:nvPicPr>
+                  <pic:blipFill>
+                    <a:blip r:embed="rId9" cstate="none"/>
+                    <a:srcRect/>
+                    <a:stretch>
+                      <a:fillRect/>
+                    </a:stretch>
+                  </pic:blipFill>
+                  <pic:spPr bwMode="auto">
+                    <a:xfrm>
+                      <a:off x="0" y="0"/>
+                      <a:ext cx="4448175" cy="2781300"/>
+                    </a:xfrm>
+                    <a:prstGeom prst="rect">
+                      <a:avLst/>
+                    </a:prstGeom>
+                  </pic:spPr>
+                </pic:pic>
+              </a:graphicData>
+            </a:graphic>
+          </wp:inline>
+        </w:drawing>
+      </w:r>
+    </w:p>
+    <w:p>
+      <w:pPr>
+        <w:spacing w:after="100" w:before="0"/>
+      </w:pPr>
+      <w:r>
+        <w:rPr>
+          <w:color w:val="56606A"/>
+          <w:sz w:val="16"/>
+          <w:szCs w:val="16"/>
+          <w:rFonts w:ascii="Calibri" w:cs="Calibri" w:eastAsia="Calibri" w:hAnsi="Calibri"/>
+        </w:rPr>
+        <w:t xml:space="preserve">Esquema de ligação dos DPS do QD-1: esquema de conexão 2 (figura 13), ligação em T (paralelo); condutores de ligação de 10 mm².</w:t>
       </w:r>
     </w:p>
     <w:p>
@@ -3426,7 +3564,67 @@
           <w:szCs w:val="26"/>
           <w:rFonts w:ascii="Calibri" w:cs="Calibri" w:eastAsia="Calibri" w:hAnsi="Calibri"/>
         </w:rPr>
-        <w:t xml:space="preserve">5. CLASSE III E COORDENAÇÃO</w:t>
+        <w:t xml:space="preserve">5. ZONAS DE PROTEÇÃO, CLASSE III E COORDENAÇÃO</w:t>
+      </w:r>
+    </w:p>
+    <w:p>
+      <w:pPr>
+        <w:keepNext/>
+        <w:spacing w:before="60" w:after="20"/>
+      </w:pPr>
+      <w:r>
+        <w:drawing>
+          <wp:inline distT="0" distB="0" distL="0" distR="0">
+            <wp:extent cx="6096000" cy="2943225"/>
+            <wp:effectExtent t="0" r="0" b="0" l="0"/>
+            <wp:docPr id="1" name="" descr="" title=""/>
+            <wp:cNvGraphicFramePr>
+              <a:graphicFrameLocks xmlns:a="http://schemas.openxmlformats.org/drawingml/2006/main" noChangeAspect="1"/>
+            </wp:cNvGraphicFramePr>
+            <a:graphic xmlns:a="http://schemas.openxmlformats.org/drawingml/2006/main">
+              <a:graphicData uri="http://schemas.openxmlformats.org/drawingml/2006/picture">
+                <pic:pic xmlns:pic="http://schemas.openxmlformats.org/drawingml/2006/picture">
+                  <pic:nvPicPr>
+                    <pic:cNvPr id="0" name="" descr=""/>
+                    <pic:cNvPicPr>
+                      <a:picLocks noChangeAspect="1" noChangeArrowheads="1"/>
+                    </pic:cNvPicPr>
+                  </pic:nvPicPr>
+                  <pic:blipFill>
+                    <a:blip r:embed="rId10" cstate="none"/>
+                    <a:srcRect/>
+                    <a:stretch>
+                      <a:fillRect/>
+                    </a:stretch>
+                  </pic:blipFill>
+                  <pic:spPr bwMode="auto">
+                    <a:xfrm>
+                      <a:off x="0" y="0"/>
+                      <a:ext cx="6096000" cy="2943225"/>
+                    </a:xfrm>
+                    <a:prstGeom prst="rect">
+                      <a:avLst/>
+                    </a:prstGeom>
+                  </pic:spPr>
+                </pic:pic>
+              </a:graphicData>
+            </a:graphic>
+          </wp:inline>
+        </w:drawing>
+      </w:r>
+    </w:p>
+    <w:p>
+      <w:pPr>
+        <w:spacing w:after="100" w:before="0"/>
+      </w:pPr>
+      <w:r>
+        <w:rPr>
+          <w:color w:val="56606A"/>
+          <w:sz w:val="16"/>
+          <w:szCs w:val="16"/>
+          <w:rFonts w:ascii="Calibri" w:cs="Calibri" w:eastAsia="Calibri" w:hAnsi="Calibri"/>
+        </w:rPr>
+        <w:t xml:space="preserve">Zonas de proteção contra raios (NBR 5419-4) e DPS em cascata: entrada na fronteira ZPR 0 → 1, quadros na ZPR 1 → 2 e DPS classe III junto aos equipamentos sensíveis (ZPR 2 → 3).</w:t>
       </w:r>
     </w:p>
     <w:p>
@@ -3473,7 +3671,375 @@
           <w:szCs w:val="26"/>
           <w:rFonts w:ascii="Calibri" w:cs="Calibri" w:eastAsia="Calibri" w:hAnsi="Calibri"/>
         </w:rPr>
-        <w:t xml:space="preserve">6. INSTALAÇÃO</w:t>
+        <w:t xml:space="preserve">6. LINHAS DE SINAL</w:t>
+      </w:r>
+    </w:p>
+    <w:p>
+      <w:pPr>
+        <w:spacing w:after="100" w:before="0"/>
+      </w:pPr>
+      <w:r>
+        <w:rPr>
+          <w:sz w:val="20"/>
+          <w:szCs w:val="20"/>
+          <w:rFonts w:ascii="Calibri" w:cs="Calibri" w:eastAsia="Calibri" w:hAnsi="Calibri"/>
+        </w:rPr>
+        <w:t xml:space="preserve">Não foram informadas linhas externas de sinal. Toda linha que vier a entrar na edificação (telefonia, dados, vídeo, antena) deve receber DPS no ponto de entrada, ligado ao BEP (NBR 5410).</w:t>
+      </w:r>
+    </w:p>
+    <w:p>
+      <w:pPr>
+        <w:pStyle w:val="Heading1"/>
+        <w:keepNext/>
+        <w:pBdr>
+          <w:bottom w:val="single" w:color="B9C3CB" w:sz="4"/>
+        </w:pBdr>
+        <w:spacing w:before="320" w:after="140"/>
+      </w:pPr>
+      <w:r>
+        <w:rPr>
+          <w:b/>
+          <w:bCs/>
+          <w:color w:val="0B5A70"/>
+          <w:sz w:val="26"/>
+          <w:szCs w:val="26"/>
+          <w:rFonts w:ascii="Calibri" w:cs="Calibri" w:eastAsia="Calibri" w:hAnsi="Calibri"/>
+        </w:rPr>
+        <w:t xml:space="preserve">7. FORMAS DE LIGAÇÃO DOS DPS</w:t>
+      </w:r>
+    </w:p>
+    <w:p>
+      <w:pPr>
+        <w:spacing w:after="100" w:before="0"/>
+      </w:pPr>
+      <w:r>
+        <w:rPr>
+          <w:sz w:val="20"/>
+          <w:szCs w:val="20"/>
+          <w:rFonts w:ascii="Calibri" w:cs="Calibri" w:eastAsia="Calibri" w:hAnsi="Calibri"/>
+        </w:rPr>
+        <w:t xml:space="preserve">A NBR 5410 (Figura 13) define três esquemas de conexão conforme o neutro e o esquema de aterramento; os condutores de ligação podem ser derivados do barramento (ligação em T, paralelo) ou passar pelos bornes do DPS (ligação em V, série). Os desenhos abaixo resumem as formas de ligar; o esquema adotado em cada quadro está na seção de seleção.</w:t>
+      </w:r>
+    </w:p>
+    <w:p>
+      <w:pPr>
+        <w:keepNext/>
+        <w:spacing w:before="60" w:after="20"/>
+      </w:pPr>
+      <w:r>
+        <w:drawing>
+          <wp:inline distT="0" distB="0" distL="0" distR="0">
+            <wp:extent cx="4448175" cy="2781300"/>
+            <wp:effectExtent t="0" r="0" b="0" l="0"/>
+            <wp:docPr id="1" name="" descr="" title=""/>
+            <wp:cNvGraphicFramePr>
+              <a:graphicFrameLocks xmlns:a="http://schemas.openxmlformats.org/drawingml/2006/main" noChangeAspect="1"/>
+            </wp:cNvGraphicFramePr>
+            <a:graphic xmlns:a="http://schemas.openxmlformats.org/drawingml/2006/main">
+              <a:graphicData uri="http://schemas.openxmlformats.org/drawingml/2006/picture">
+                <pic:pic xmlns:pic="http://schemas.openxmlformats.org/drawingml/2006/picture">
+                  <pic:nvPicPr>
+                    <pic:cNvPr id="0" name="" descr=""/>
+                    <pic:cNvPicPr>
+                      <a:picLocks noChangeAspect="1" noChangeArrowheads="1"/>
+                    </pic:cNvPicPr>
+                  </pic:nvPicPr>
+                  <pic:blipFill>
+                    <a:blip r:embed="rId11" cstate="none"/>
+                    <a:srcRect/>
+                    <a:stretch>
+                      <a:fillRect/>
+                    </a:stretch>
+                  </pic:blipFill>
+                  <pic:spPr bwMode="auto">
+                    <a:xfrm>
+                      <a:off x="0" y="0"/>
+                      <a:ext cx="4448175" cy="2781300"/>
+                    </a:xfrm>
+                    <a:prstGeom prst="rect">
+                      <a:avLst/>
+                    </a:prstGeom>
+                  </pic:spPr>
+                </pic:pic>
+              </a:graphicData>
+            </a:graphic>
+          </wp:inline>
+        </w:drawing>
+      </w:r>
+    </w:p>
+    <w:p>
+      <w:pPr>
+        <w:spacing w:after="100" w:before="0"/>
+      </w:pPr>
+      <w:r>
+        <w:rPr>
+          <w:color w:val="56606A"/>
+          <w:sz w:val="16"/>
+          <w:szCs w:val="16"/>
+          <w:rFonts w:ascii="Calibri" w:cs="Calibri" w:eastAsia="Calibri" w:hAnsi="Calibri"/>
+        </w:rPr>
+        <w:t xml:space="preserve">Esquema 1 — neutro aterrado no BEP. TN-C-S no quadro de entrada (PEN separado no BEP): DPS só nas fases, ligados ao BEP.</w:t>
+      </w:r>
+    </w:p>
+    <w:p>
+      <w:pPr>
+        <w:keepNext/>
+        <w:spacing w:before="60" w:after="20"/>
+      </w:pPr>
+      <w:r>
+        <w:drawing>
+          <wp:inline distT="0" distB="0" distL="0" distR="0">
+            <wp:extent cx="4448175" cy="2781300"/>
+            <wp:effectExtent t="0" r="0" b="0" l="0"/>
+            <wp:docPr id="1" name="" descr="" title=""/>
+            <wp:cNvGraphicFramePr>
+              <a:graphicFrameLocks xmlns:a="http://schemas.openxmlformats.org/drawingml/2006/main" noChangeAspect="1"/>
+            </wp:cNvGraphicFramePr>
+            <a:graphic xmlns:a="http://schemas.openxmlformats.org/drawingml/2006/main">
+              <a:graphicData uri="http://schemas.openxmlformats.org/drawingml/2006/picture">
+                <pic:pic xmlns:pic="http://schemas.openxmlformats.org/drawingml/2006/picture">
+                  <pic:nvPicPr>
+                    <pic:cNvPr id="0" name="" descr=""/>
+                    <pic:cNvPicPr>
+                      <a:picLocks noChangeAspect="1" noChangeArrowheads="1"/>
+                    </pic:cNvPicPr>
+                  </pic:nvPicPr>
+                  <pic:blipFill>
+                    <a:blip r:embed="rId12" cstate="none"/>
+                    <a:srcRect/>
+                    <a:stretch>
+                      <a:fillRect/>
+                    </a:stretch>
+                  </pic:blipFill>
+                  <pic:spPr bwMode="auto">
+                    <a:xfrm>
+                      <a:off x="0" y="0"/>
+                      <a:ext cx="4448175" cy="2781300"/>
+                    </a:xfrm>
+                    <a:prstGeom prst="rect">
+                      <a:avLst/>
+                    </a:prstGeom>
+                  </pic:spPr>
+                </pic:pic>
+              </a:graphicData>
+            </a:graphic>
+          </wp:inline>
+        </w:drawing>
+      </w:r>
+    </w:p>
+    <w:p>
+      <w:pPr>
+        <w:spacing w:after="100" w:before="0"/>
+      </w:pPr>
+      <w:r>
+        <w:rPr>
+          <w:color w:val="56606A"/>
+          <w:sz w:val="16"/>
+          <w:szCs w:val="16"/>
+          <w:rFonts w:ascii="Calibri" w:cs="Calibri" w:eastAsia="Calibri" w:hAnsi="Calibri"/>
+        </w:rPr>
+        <w:t xml:space="preserve">Esquema 2 — n+0 (fases e neutro ao PE). TN-S e TT a jusante do DR: um DPS por condutor vivo, todos ao PE.</w:t>
+      </w:r>
+    </w:p>
+    <w:p>
+      <w:pPr>
+        <w:keepNext/>
+        <w:spacing w:before="60" w:after="20"/>
+      </w:pPr>
+      <w:r>
+        <w:drawing>
+          <wp:inline distT="0" distB="0" distL="0" distR="0">
+            <wp:extent cx="4448175" cy="2781300"/>
+            <wp:effectExtent t="0" r="0" b="0" l="0"/>
+            <wp:docPr id="1" name="" descr="" title=""/>
+            <wp:cNvGraphicFramePr>
+              <a:graphicFrameLocks xmlns:a="http://schemas.openxmlformats.org/drawingml/2006/main" noChangeAspect="1"/>
+            </wp:cNvGraphicFramePr>
+            <a:graphic xmlns:a="http://schemas.openxmlformats.org/drawingml/2006/main">
+              <a:graphicData uri="http://schemas.openxmlformats.org/drawingml/2006/picture">
+                <pic:pic xmlns:pic="http://schemas.openxmlformats.org/drawingml/2006/picture">
+                  <pic:nvPicPr>
+                    <pic:cNvPr id="0" name="" descr=""/>
+                    <pic:cNvPicPr>
+                      <a:picLocks noChangeAspect="1" noChangeArrowheads="1"/>
+                    </pic:cNvPicPr>
+                  </pic:nvPicPr>
+                  <pic:blipFill>
+                    <a:blip r:embed="rId13" cstate="none"/>
+                    <a:srcRect/>
+                    <a:stretch>
+                      <a:fillRect/>
+                    </a:stretch>
+                  </pic:blipFill>
+                  <pic:spPr bwMode="auto">
+                    <a:xfrm>
+                      <a:off x="0" y="0"/>
+                      <a:ext cx="4448175" cy="2781300"/>
+                    </a:xfrm>
+                    <a:prstGeom prst="rect">
+                      <a:avLst/>
+                    </a:prstGeom>
+                  </pic:spPr>
+                </pic:pic>
+              </a:graphicData>
+            </a:graphic>
+          </wp:inline>
+        </w:drawing>
+      </w:r>
+    </w:p>
+    <w:p>
+      <w:pPr>
+        <w:spacing w:after="100" w:before="0"/>
+      </w:pPr>
+      <w:r>
+        <w:rPr>
+          <w:color w:val="56606A"/>
+          <w:sz w:val="16"/>
+          <w:szCs w:val="16"/>
+          <w:rFonts w:ascii="Calibri" w:cs="Calibri" w:eastAsia="Calibri" w:hAnsi="Calibri"/>
+        </w:rPr>
+        <w:t xml:space="preserve">Esquema 3 — n+1 (fases ao neutro e centelhador N–PE). TT a montante do DR (3+1): o centelhador N–PE recebe a soma das correntes.</w:t>
+      </w:r>
+    </w:p>
+    <w:p>
+      <w:pPr>
+        <w:keepNext/>
+        <w:spacing w:before="60" w:after="20"/>
+      </w:pPr>
+      <w:r>
+        <w:drawing>
+          <wp:inline distT="0" distB="0" distL="0" distR="0">
+            <wp:extent cx="4448175" cy="2781300"/>
+            <wp:effectExtent t="0" r="0" b="0" l="0"/>
+            <wp:docPr id="1" name="" descr="" title=""/>
+            <wp:cNvGraphicFramePr>
+              <a:graphicFrameLocks xmlns:a="http://schemas.openxmlformats.org/drawingml/2006/main" noChangeAspect="1"/>
+            </wp:cNvGraphicFramePr>
+            <a:graphic xmlns:a="http://schemas.openxmlformats.org/drawingml/2006/main">
+              <a:graphicData uri="http://schemas.openxmlformats.org/drawingml/2006/picture">
+                <pic:pic xmlns:pic="http://schemas.openxmlformats.org/drawingml/2006/picture">
+                  <pic:nvPicPr>
+                    <pic:cNvPr id="0" name="" descr=""/>
+                    <pic:cNvPicPr>
+                      <a:picLocks noChangeAspect="1" noChangeArrowheads="1"/>
+                    </pic:cNvPicPr>
+                  </pic:nvPicPr>
+                  <pic:blipFill>
+                    <a:blip r:embed="rId14" cstate="none"/>
+                    <a:srcRect/>
+                    <a:stretch>
+                      <a:fillRect/>
+                    </a:stretch>
+                  </pic:blipFill>
+                  <pic:spPr bwMode="auto">
+                    <a:xfrm>
+                      <a:off x="0" y="0"/>
+                      <a:ext cx="4448175" cy="2781300"/>
+                    </a:xfrm>
+                    <a:prstGeom prst="rect">
+                      <a:avLst/>
+                    </a:prstGeom>
+                  </pic:spPr>
+                </pic:pic>
+              </a:graphicData>
+            </a:graphic>
+          </wp:inline>
+        </w:drawing>
+      </w:r>
+    </w:p>
+    <w:p>
+      <w:pPr>
+        <w:spacing w:after="100" w:before="0"/>
+      </w:pPr>
+      <w:r>
+        <w:rPr>
+          <w:color w:val="56606A"/>
+          <w:sz w:val="16"/>
+          <w:szCs w:val="16"/>
+          <w:rFonts w:ascii="Calibri" w:cs="Calibri" w:eastAsia="Calibri" w:hAnsi="Calibri"/>
+        </w:rPr>
+        <w:t xml:space="preserve">Ligação em T (paralelo) com retaguarda F2. O DPS fica num ramal com fusível próprio; a + b ≤ 0,5 m; a atuação de F2 tira só o DPS de serviço — use a sinalização remota.</w:t>
+      </w:r>
+    </w:p>
+    <w:p>
+      <w:pPr>
+        <w:keepNext/>
+        <w:spacing w:before="60" w:after="20"/>
+      </w:pPr>
+      <w:r>
+        <w:drawing>
+          <wp:inline distT="0" distB="0" distL="0" distR="0">
+            <wp:extent cx="4448175" cy="2781300"/>
+            <wp:effectExtent t="0" r="0" b="0" l="0"/>
+            <wp:docPr id="1" name="" descr="" title=""/>
+            <wp:cNvGraphicFramePr>
+              <a:graphicFrameLocks xmlns:a="http://schemas.openxmlformats.org/drawingml/2006/main" noChangeAspect="1"/>
+            </wp:cNvGraphicFramePr>
+            <a:graphic xmlns:a="http://schemas.openxmlformats.org/drawingml/2006/main">
+              <a:graphicData uri="http://schemas.openxmlformats.org/drawingml/2006/picture">
+                <pic:pic xmlns:pic="http://schemas.openxmlformats.org/drawingml/2006/picture">
+                  <pic:nvPicPr>
+                    <pic:cNvPr id="0" name="" descr=""/>
+                    <pic:cNvPicPr>
+                      <a:picLocks noChangeAspect="1" noChangeArrowheads="1"/>
+                    </pic:cNvPicPr>
+                  </pic:nvPicPr>
+                  <pic:blipFill>
+                    <a:blip r:embed="rId15" cstate="none"/>
+                    <a:srcRect/>
+                    <a:stretch>
+                      <a:fillRect/>
+                    </a:stretch>
+                  </pic:blipFill>
+                  <pic:spPr bwMode="auto">
+                    <a:xfrm>
+                      <a:off x="0" y="0"/>
+                      <a:ext cx="4448175" cy="2781300"/>
+                    </a:xfrm>
+                    <a:prstGeom prst="rect">
+                      <a:avLst/>
+                    </a:prstGeom>
+                  </pic:spPr>
+                </pic:pic>
+              </a:graphicData>
+            </a:graphic>
+          </wp:inline>
+        </w:drawing>
+      </w:r>
+    </w:p>
+    <w:p>
+      <w:pPr>
+        <w:spacing w:after="100" w:before="0"/>
+      </w:pPr>
+      <w:r>
+        <w:rPr>
+          <w:color w:val="56606A"/>
+          <w:sz w:val="16"/>
+          <w:szCs w:val="16"/>
+          <w:rFonts w:ascii="Calibri" w:cs="Calibri" w:eastAsia="Calibri" w:hAnsi="Calibri"/>
+        </w:rPr>
+        <w:t xml:space="preserve">Ligação em V (série). O condutor entra e sai pelos bornes do DPS: ΔU desprezível; protegido pelo F1 dentro do limite do fabricante.</w:t>
+      </w:r>
+    </w:p>
+    <w:p>
+      <w:pPr>
+        <w:pStyle w:val="Heading1"/>
+        <w:keepNext/>
+        <w:pBdr>
+          <w:bottom w:val="single" w:color="B9C3CB" w:sz="4"/>
+        </w:pBdr>
+        <w:spacing w:before="320" w:after="140"/>
+      </w:pPr>
+      <w:r>
+        <w:rPr>
+          <w:b/>
+          <w:bCs/>
+          <w:color w:val="0B5A70"/>
+          <w:sz w:val="26"/>
+          <w:szCs w:val="26"/>
+          <w:rFonts w:ascii="Calibri" w:cs="Calibri" w:eastAsia="Calibri" w:hAnsi="Calibri"/>
+        </w:rPr>
+        <w:t xml:space="preserve">8. INSTALAÇÃO</w:t>
       </w:r>
     </w:p>
     <w:p>
@@ -3527,7 +4093,7 @@
           <w:szCs w:val="19"/>
           <w:rFonts w:ascii="Calibri" w:cs="Calibri" w:eastAsia="Calibri" w:hAnsi="Calibri"/>
         </w:rPr>
-        <w:t xml:space="preserve">Interligar o barramento PE dos quadros ao BEP; com SPDA, ligar o DPS de entrada ao BEP pelo caminho mais curto.</w:t>
+        <w:t xml:space="preserve">Interligar o barramento PE dos quadros ao BEP; com SPDA, ligar o DPS de entrada ao BEP pelo caminho mais curto. Equipotencializar no BEP todas as linhas e tubulações metálicas que entram na edificação.</w:t>
       </w:r>
     </w:p>
     <w:p>
@@ -3566,7 +4132,7 @@
           <w:szCs w:val="26"/>
           <w:rFonts w:ascii="Calibri" w:cs="Calibri" w:eastAsia="Calibri" w:hAnsi="Calibri"/>
         </w:rPr>
-        <w:t xml:space="preserve">7. CONCLUSÃO</w:t>
+        <w:t xml:space="preserve">9. CONCLUSÃO</w:t>
       </w:r>
     </w:p>
     <w:p>

</xml_diff>

<commit_message>
DPS: ligação em V e em T, desenho do BEP e conteúdo da memória à escolha
- Forma de ligação por quadro (T paralelo / V série); em V, verifica a
  corrente nominal de carga dos bornes (IL) contra a proteção a montante e
  a seção do alimentador contra o borne; em T, F2 e sinalização remota
- Tabela comparativa V x T e desenhos na aba DPS, nas tabelas e na memória
- Equipotencialização principal: posição do BEP (NBR 5410, Figura 13,
  nota a), itens ligados, seções (NBR 5410; NBR 5419-3 com SPDA) e desenho
  com eletrodo, condutor de aterramento, BEP, DPS, linha de sinal, tubulações,
  armaduras e SPDA
- Opções do que entra na memória: esquema de cada quadro, V x T, formas da
  Figura 13, BEP e zonas de proteção
- README e testes atualizados

Co-Authored-By: Claude Opus 5.5 <noreply@anthropic.com>
Claude-Session: https://claude.ai/code/session_01E4Px4gvzC9MkKBX1rn21ys
</commit_message>
<xml_diff>
--- a/exemplo/memoria-dps-residencia-unifamiliar-exemplo-r00.docx
+++ b/exemplo/memoria-dps-residencia-unifamiliar-exemplo-r00.docx
@@ -2697,6 +2697,21 @@
           <w:rFonts w:ascii="Calibri" w:cs="Calibri" w:eastAsia="Calibri" w:hAnsi="Calibri"/>
         </w:rPr>
         <w:t xml:space="preserve">✓ Seção pela proteção a montante de 70 A — ligação em paralelo (em T), catálogo Siemens: lado da fase 10 mm², lado do PE 16 mm²</w:t>
+      </w:r>
+    </w:p>
+    <w:p>
+      <w:pPr>
+        <w:spacing w:after="100" w:before="0"/>
+        <w:ind w:left="200"/>
+      </w:pPr>
+      <w:r>
+        <w:rPr>
+          <w:color w:val="56606A"/>
+          <w:sz w:val="18"/>
+          <w:szCs w:val="18"/>
+          <w:rFonts w:ascii="Calibri" w:cs="Calibri" w:eastAsia="Calibri" w:hAnsi="Calibri"/>
+        </w:rPr>
+        <w:t xml:space="preserve">Ligação dos DPS de entrada: BEP — a barra PE do quadro de entrada acumula a função de BEP (NBR 5410, Figura 13, nota a)</w:t>
       </w:r>
     </w:p>
     <w:p>
@@ -3716,6 +3731,36 @@
     </w:p>
     <w:p>
       <w:pPr>
+        <w:spacing w:after="100" w:before="0"/>
+        <w:ind w:left="200"/>
+      </w:pPr>
+      <w:r>
+        <w:rPr>
+          <w:color w:val="56606A"/>
+          <w:sz w:val="18"/>
+          <w:szCs w:val="18"/>
+          <w:rFonts w:ascii="Calibri" w:cs="Calibri" w:eastAsia="Calibri" w:hAnsi="Calibri"/>
+        </w:rPr>
+        <w:t xml:space="preserve">Ligação em V: a corrente de carga passa pelos bornes do DPS — confirme na ficha a corrente nominal de carga em V (IL, típica de 125 A), que deve ser ≥ 63 A da proteção a montante</w:t>
+      </w:r>
+    </w:p>
+    <w:p>
+      <w:pPr>
+        <w:spacing w:after="100" w:before="0"/>
+        <w:ind w:left="200"/>
+      </w:pPr>
+      <w:r>
+        <w:rPr>
+          <w:color w:val="56606A"/>
+          <w:sz w:val="18"/>
+          <w:szCs w:val="18"/>
+          <w:rFonts w:ascii="Calibri" w:cs="Calibri" w:eastAsia="Calibri" w:hAnsi="Calibri"/>
+        </w:rPr>
+        <w:t xml:space="preserve">Ligação em V: a retaguarda é a própria proteção a montante; se ela atuar por falha do DPS, desliga a instalação a jusante (catálogo Siemens).</w:t>
+      </w:r>
+    </w:p>
+    <w:p>
+      <w:pPr>
         <w:spacing w:after="50"/>
       </w:pPr>
       <w:r>
@@ -4436,7 +4481,7 @@
           <w:szCs w:val="26"/>
           <w:rFonts w:ascii="Calibri" w:cs="Calibri" w:eastAsia="Calibri" w:hAnsi="Calibri"/>
         </w:rPr>
-        <w:t xml:space="preserve">8. FORMAS DE LIGAÇÃO DOS DPS</w:t>
+        <w:t xml:space="preserve">8. LIGAÇÃO EM V E EM T</w:t>
       </w:r>
     </w:p>
     <w:p>
@@ -4449,8 +4494,734 @@
           <w:szCs w:val="20"/>
           <w:rFonts w:ascii="Calibri" w:cs="Calibri" w:eastAsia="Calibri" w:hAnsi="Calibri"/>
         </w:rPr>
-        <w:t xml:space="preserve">A NBR 5410 (Figura 13) define três esquemas de conexão conforme o neutro e o esquema de aterramento; os condutores de ligação podem ser derivados do barramento (ligação em T, paralelo) ou passar pelos bornes do DPS (ligação em V, série). Os desenhos abaixo resumem as formas de ligar; o esquema adotado em cada quadro está na seção de seleção.</w:t>
-      </w:r>
+        <w:t xml:space="preserve">Os condutores de ligação do DPS podem ser derivados do barramento até o DPS e do DPS à barra PE (ligação em T, paralelo), com a + b ≤ 0,5 m, ou o condutor de chegada pode entrar e sair pelos bornes do DPS (ligação em V, série), restando só o trecho b até a barra PE (IEC 60364-5-534; NBR 5410). Neste projeto: QM em T; QD-1 em V.</w:t>
+      </w:r>
+    </w:p>
+    <w:tbl>
+      <w:tblPr>
+        <w:tblW w:type="pct" w:w="100%"/>
+        <w:tblBorders>
+          <w:top w:val="single" w:color="auto" w:sz="4"/>
+          <w:left w:val="single" w:color="auto" w:sz="4"/>
+          <w:bottom w:val="single" w:color="auto" w:sz="4"/>
+          <w:right w:val="single" w:color="auto" w:sz="4"/>
+          <w:insideH w:val="single" w:color="auto" w:sz="4"/>
+          <w:insideV w:val="single" w:color="auto" w:sz="4"/>
+        </w:tblBorders>
+        <w:tblLayout w:type="fixed"/>
+      </w:tblPr>
+      <w:tblGrid>
+        <w:gridCol w:w="1951"/>
+        <w:gridCol w:w="3902"/>
+        <w:gridCol w:w="3902"/>
+      </w:tblGrid>
+      <w:tr>
+        <w:trPr>
+          <w:tblHeader/>
+        </w:trPr>
+        <w:tc>
+          <w:tcPr>
+            <w:tcW w:type="dxa" w:w="1951"/>
+            <w:shd w:fill="E7EDF1" w:color="auto" w:val="clear"/>
+            <w:tcMar>
+              <w:top w:type="dxa" w:w="30"/>
+              <w:left w:type="dxa" w:w="70"/>
+              <w:bottom w:type="dxa" w:w="30"/>
+              <w:right w:type="dxa" w:w="70"/>
+            </w:tcMar>
+          </w:tcPr>
+          <w:p>
+            <w:pPr>
+              <w:jc w:val="left"/>
+            </w:pPr>
+            <w:r>
+              <w:rPr>
+                <w:b/>
+                <w:bCs/>
+                <w:sz w:val="15"/>
+                <w:szCs w:val="15"/>
+                <w:rFonts w:ascii="Calibri" w:cs="Calibri" w:eastAsia="Calibri" w:hAnsi="Calibri"/>
+              </w:rPr>
+              <w:t xml:space="preserve">Aspecto</w:t>
+            </w:r>
+          </w:p>
+        </w:tc>
+        <w:tc>
+          <w:tcPr>
+            <w:tcW w:type="dxa" w:w="3902"/>
+            <w:shd w:fill="E7EDF1" w:color="auto" w:val="clear"/>
+            <w:tcMar>
+              <w:top w:type="dxa" w:w="30"/>
+              <w:left w:type="dxa" w:w="70"/>
+              <w:bottom w:type="dxa" w:w="30"/>
+              <w:right w:type="dxa" w:w="70"/>
+            </w:tcMar>
+          </w:tcPr>
+          <w:p>
+            <w:pPr>
+              <w:jc w:val="left"/>
+            </w:pPr>
+            <w:r>
+              <w:rPr>
+                <w:b/>
+                <w:bCs/>
+                <w:sz w:val="15"/>
+                <w:szCs w:val="15"/>
+                <w:rFonts w:ascii="Calibri" w:cs="Calibri" w:eastAsia="Calibri" w:hAnsi="Calibri"/>
+              </w:rPr>
+              <w:t xml:space="preserve">T — paralelo (derivação)</w:t>
+            </w:r>
+          </w:p>
+        </w:tc>
+        <w:tc>
+          <w:tcPr>
+            <w:tcW w:type="dxa" w:w="3902"/>
+            <w:shd w:fill="E7EDF1" w:color="auto" w:val="clear"/>
+            <w:tcMar>
+              <w:top w:type="dxa" w:w="30"/>
+              <w:left w:type="dxa" w:w="70"/>
+              <w:bottom w:type="dxa" w:w="30"/>
+              <w:right w:type="dxa" w:w="70"/>
+            </w:tcMar>
+          </w:tcPr>
+          <w:p>
+            <w:pPr>
+              <w:jc w:val="left"/>
+            </w:pPr>
+            <w:r>
+              <w:rPr>
+                <w:b/>
+                <w:bCs/>
+                <w:sz w:val="15"/>
+                <w:szCs w:val="15"/>
+                <w:rFonts w:ascii="Calibri" w:cs="Calibri" w:eastAsia="Calibri" w:hAnsi="Calibri"/>
+              </w:rPr>
+              <w:t xml:space="preserve">V — série (passante)</w:t>
+            </w:r>
+          </w:p>
+        </w:tc>
+      </w:tr>
+      <w:tr>
+        <w:trPr>
+          <w:cantSplit/>
+        </w:trPr>
+        <w:tc>
+          <w:tcPr>
+            <w:tcW w:type="dxa" w:w="1951"/>
+            <w:tcMar>
+              <w:top w:type="dxa" w:w="30"/>
+              <w:left w:type="dxa" w:w="70"/>
+              <w:bottom w:type="dxa" w:w="30"/>
+              <w:right w:type="dxa" w:w="70"/>
+            </w:tcMar>
+          </w:tcPr>
+          <w:p>
+            <w:pPr>
+              <w:jc w:val="left"/>
+            </w:pPr>
+            <w:r>
+              <w:rPr>
+                <w:sz w:val="15"/>
+                <w:szCs w:val="15"/>
+                <w:rFonts w:ascii="Calibri" w:cs="Calibri" w:eastAsia="Calibri" w:hAnsi="Calibri"/>
+              </w:rPr>
+              <w:t xml:space="preserve">Como liga</w:t>
+            </w:r>
+          </w:p>
+        </w:tc>
+        <w:tc>
+          <w:tcPr>
+            <w:tcW w:type="dxa" w:w="3902"/>
+            <w:tcMar>
+              <w:top w:type="dxa" w:w="30"/>
+              <w:left w:type="dxa" w:w="70"/>
+              <w:bottom w:type="dxa" w:w="30"/>
+              <w:right w:type="dxa" w:w="70"/>
+            </w:tcMar>
+          </w:tcPr>
+          <w:p>
+            <w:pPr>
+              <w:jc w:val="left"/>
+            </w:pPr>
+            <w:r>
+              <w:rPr>
+                <w:sz w:val="15"/>
+                <w:szCs w:val="15"/>
+                <w:rFonts w:ascii="Calibri" w:cs="Calibri" w:eastAsia="Calibri" w:hAnsi="Calibri"/>
+              </w:rPr>
+              <w:t xml:space="preserve">derivação do barramento até o DPS e do DPS à barra PE / BEP</w:t>
+            </w:r>
+          </w:p>
+        </w:tc>
+        <w:tc>
+          <w:tcPr>
+            <w:tcW w:type="dxa" w:w="3902"/>
+            <w:tcMar>
+              <w:top w:type="dxa" w:w="30"/>
+              <w:left w:type="dxa" w:w="70"/>
+              <w:bottom w:type="dxa" w:w="30"/>
+              <w:right w:type="dxa" w:w="70"/>
+            </w:tcMar>
+          </w:tcPr>
+          <w:p>
+            <w:pPr>
+              <w:jc w:val="left"/>
+            </w:pPr>
+            <w:r>
+              <w:rPr>
+                <w:sz w:val="15"/>
+                <w:szCs w:val="15"/>
+                <w:rFonts w:ascii="Calibri" w:cs="Calibri" w:eastAsia="Calibri" w:hAnsi="Calibri"/>
+              </w:rPr>
+              <w:t xml:space="preserve">o condutor de chegada entra e sai pelos bornes do DPS (borne duplo); só o lado do PE é derivação</w:t>
+            </w:r>
+          </w:p>
+        </w:tc>
+      </w:tr>
+      <w:tr>
+        <w:trPr>
+          <w:cantSplit/>
+        </w:trPr>
+        <w:tc>
+          <w:tcPr>
+            <w:tcW w:type="dxa" w:w="1951"/>
+            <w:tcMar>
+              <w:top w:type="dxa" w:w="30"/>
+              <w:left w:type="dxa" w:w="70"/>
+              <w:bottom w:type="dxa" w:w="30"/>
+              <w:right w:type="dxa" w:w="70"/>
+            </w:tcMar>
+          </w:tcPr>
+          <w:p>
+            <w:pPr>
+              <w:jc w:val="left"/>
+            </w:pPr>
+            <w:r>
+              <w:rPr>
+                <w:sz w:val="15"/>
+                <w:szCs w:val="15"/>
+                <w:rFonts w:ascii="Calibri" w:cs="Calibri" w:eastAsia="Calibri" w:hAnsi="Calibri"/>
+              </w:rPr>
+              <w:t xml:space="preserve">Comprimento dos condutores</w:t>
+            </w:r>
+          </w:p>
+        </w:tc>
+        <w:tc>
+          <w:tcPr>
+            <w:tcW w:type="dxa" w:w="3902"/>
+            <w:tcMar>
+              <w:top w:type="dxa" w:w="30"/>
+              <w:left w:type="dxa" w:w="70"/>
+              <w:bottom w:type="dxa" w:w="30"/>
+              <w:right w:type="dxa" w:w="70"/>
+            </w:tcMar>
+          </w:tcPr>
+          <w:p>
+            <w:pPr>
+              <w:jc w:val="left"/>
+            </w:pPr>
+            <w:r>
+              <w:rPr>
+                <w:sz w:val="15"/>
+                <w:szCs w:val="15"/>
+                <w:rFonts w:ascii="Calibri" w:cs="Calibri" w:eastAsia="Calibri" w:hAnsi="Calibri"/>
+              </w:rPr>
+              <w:t xml:space="preserve">a + b ≤ 0,5 m (fase → DPS → PE)</w:t>
+            </w:r>
+          </w:p>
+        </w:tc>
+        <w:tc>
+          <w:tcPr>
+            <w:tcW w:type="dxa" w:w="3902"/>
+            <w:tcMar>
+              <w:top w:type="dxa" w:w="30"/>
+              <w:left w:type="dxa" w:w="70"/>
+              <w:bottom w:type="dxa" w:w="30"/>
+              <w:right w:type="dxa" w:w="70"/>
+            </w:tcMar>
+          </w:tcPr>
+          <w:p>
+            <w:pPr>
+              <w:jc w:val="left"/>
+            </w:pPr>
+            <w:r>
+              <w:rPr>
+                <w:sz w:val="15"/>
+                <w:szCs w:val="15"/>
+                <w:rFonts w:ascii="Calibri" w:cs="Calibri" w:eastAsia="Calibri" w:hAnsi="Calibri"/>
+              </w:rPr>
+              <w:t xml:space="preserve">b ≤ 0,5 m (DPS → PE); a ≈ 0</w:t>
+            </w:r>
+          </w:p>
+        </w:tc>
+      </w:tr>
+      <w:tr>
+        <w:trPr>
+          <w:cantSplit/>
+        </w:trPr>
+        <w:tc>
+          <w:tcPr>
+            <w:tcW w:type="dxa" w:w="1951"/>
+            <w:tcMar>
+              <w:top w:type="dxa" w:w="30"/>
+              <w:left w:type="dxa" w:w="70"/>
+              <w:bottom w:type="dxa" w:w="30"/>
+              <w:right w:type="dxa" w:w="70"/>
+            </w:tcMar>
+          </w:tcPr>
+          <w:p>
+            <w:pPr>
+              <w:jc w:val="left"/>
+            </w:pPr>
+            <w:r>
+              <w:rPr>
+                <w:sz w:val="15"/>
+                <w:szCs w:val="15"/>
+                <w:rFonts w:ascii="Calibri" w:cs="Calibri" w:eastAsia="Calibri" w:hAnsi="Calibri"/>
+              </w:rPr>
+              <w:t xml:space="preserve">Queda nos condutores (ΔU)</w:t>
+            </w:r>
+          </w:p>
+        </w:tc>
+        <w:tc>
+          <w:tcPr>
+            <w:tcW w:type="dxa" w:w="3902"/>
+            <w:tcMar>
+              <w:top w:type="dxa" w:w="30"/>
+              <w:left w:type="dxa" w:w="70"/>
+              <w:bottom w:type="dxa" w:w="30"/>
+              <w:right w:type="dxa" w:w="70"/>
+            </w:tcMar>
+          </w:tcPr>
+          <w:p>
+            <w:pPr>
+              <w:jc w:val="left"/>
+            </w:pPr>
+            <w:r>
+              <w:rPr>
+                <w:sz w:val="15"/>
+                <w:szCs w:val="15"/>
+                <w:rFonts w:ascii="Calibri" w:cs="Calibri" w:eastAsia="Calibri" w:hAnsi="Calibri"/>
+              </w:rPr>
+              <w:t xml:space="preserve">≈ 1 kV/m × (a + b), soma ao Up</w:t>
+            </w:r>
+          </w:p>
+        </w:tc>
+        <w:tc>
+          <w:tcPr>
+            <w:tcW w:type="dxa" w:w="3902"/>
+            <w:tcMar>
+              <w:top w:type="dxa" w:w="30"/>
+              <w:left w:type="dxa" w:w="70"/>
+              <w:bottom w:type="dxa" w:w="30"/>
+              <w:right w:type="dxa" w:w="70"/>
+            </w:tcMar>
+          </w:tcPr>
+          <w:p>
+            <w:pPr>
+              <w:jc w:val="left"/>
+            </w:pPr>
+            <w:r>
+              <w:rPr>
+                <w:sz w:val="15"/>
+                <w:szCs w:val="15"/>
+                <w:rFonts w:ascii="Calibri" w:cs="Calibri" w:eastAsia="Calibri" w:hAnsi="Calibri"/>
+              </w:rPr>
+              <w:t xml:space="preserve">desprezível no lado da fase: Up/f ≈ Up</w:t>
+            </w:r>
+          </w:p>
+        </w:tc>
+      </w:tr>
+      <w:tr>
+        <w:trPr>
+          <w:cantSplit/>
+        </w:trPr>
+        <w:tc>
+          <w:tcPr>
+            <w:tcW w:type="dxa" w:w="1951"/>
+            <w:tcMar>
+              <w:top w:type="dxa" w:w="30"/>
+              <w:left w:type="dxa" w:w="70"/>
+              <w:bottom w:type="dxa" w:w="30"/>
+              <w:right w:type="dxa" w:w="70"/>
+            </w:tcMar>
+          </w:tcPr>
+          <w:p>
+            <w:pPr>
+              <w:jc w:val="left"/>
+            </w:pPr>
+            <w:r>
+              <w:rPr>
+                <w:sz w:val="15"/>
+                <w:szCs w:val="15"/>
+                <w:rFonts w:ascii="Calibri" w:cs="Calibri" w:eastAsia="Calibri" w:hAnsi="Calibri"/>
+              </w:rPr>
+              <w:t xml:space="preserve">Corrente nos bornes</w:t>
+            </w:r>
+          </w:p>
+        </w:tc>
+        <w:tc>
+          <w:tcPr>
+            <w:tcW w:type="dxa" w:w="3902"/>
+            <w:tcMar>
+              <w:top w:type="dxa" w:w="30"/>
+              <w:left w:type="dxa" w:w="70"/>
+              <w:bottom w:type="dxa" w:w="30"/>
+              <w:right w:type="dxa" w:w="70"/>
+            </w:tcMar>
+          </w:tcPr>
+          <w:p>
+            <w:pPr>
+              <w:jc w:val="left"/>
+            </w:pPr>
+            <w:r>
+              <w:rPr>
+                <w:sz w:val="15"/>
+                <w:szCs w:val="15"/>
+                <w:rFonts w:ascii="Calibri" w:cs="Calibri" w:eastAsia="Calibri" w:hAnsi="Calibri"/>
+              </w:rPr>
+              <w:t xml:space="preserve">só a corrente de surto</w:t>
+            </w:r>
+          </w:p>
+        </w:tc>
+        <w:tc>
+          <w:tcPr>
+            <w:tcW w:type="dxa" w:w="3902"/>
+            <w:tcMar>
+              <w:top w:type="dxa" w:w="30"/>
+              <w:left w:type="dxa" w:w="70"/>
+              <w:bottom w:type="dxa" w:w="30"/>
+              <w:right w:type="dxa" w:w="70"/>
+            </w:tcMar>
+          </w:tcPr>
+          <w:p>
+            <w:pPr>
+              <w:jc w:val="left"/>
+            </w:pPr>
+            <w:r>
+              <w:rPr>
+                <w:sz w:val="15"/>
+                <w:szCs w:val="15"/>
+                <w:rFonts w:ascii="Calibri" w:cs="Calibri" w:eastAsia="Calibri" w:hAnsi="Calibri"/>
+              </w:rPr>
+              <w:t xml:space="preserve">corrente de carga contínua: limitada à corrente nominal de carga em V do DPS (IL, típica de 125 A)</w:t>
+            </w:r>
+          </w:p>
+        </w:tc>
+      </w:tr>
+      <w:tr>
+        <w:trPr>
+          <w:cantSplit/>
+        </w:trPr>
+        <w:tc>
+          <w:tcPr>
+            <w:tcW w:type="dxa" w:w="1951"/>
+            <w:tcMar>
+              <w:top w:type="dxa" w:w="30"/>
+              <w:left w:type="dxa" w:w="70"/>
+              <w:bottom w:type="dxa" w:w="30"/>
+              <w:right w:type="dxa" w:w="70"/>
+            </w:tcMar>
+          </w:tcPr>
+          <w:p>
+            <w:pPr>
+              <w:jc w:val="left"/>
+            </w:pPr>
+            <w:r>
+              <w:rPr>
+                <w:sz w:val="15"/>
+                <w:szCs w:val="15"/>
+                <w:rFonts w:ascii="Calibri" w:cs="Calibri" w:eastAsia="Calibri" w:hAnsi="Calibri"/>
+              </w:rPr>
+              <w:t xml:space="preserve">Retaguarda</w:t>
+            </w:r>
+          </w:p>
+        </w:tc>
+        <w:tc>
+          <w:tcPr>
+            <w:tcW w:type="dxa" w:w="3902"/>
+            <w:tcMar>
+              <w:top w:type="dxa" w:w="30"/>
+              <w:left w:type="dxa" w:w="70"/>
+              <w:bottom w:type="dxa" w:w="30"/>
+              <w:right w:type="dxa" w:w="70"/>
+            </w:tcMar>
+          </w:tcPr>
+          <w:p>
+            <w:pPr>
+              <w:jc w:val="left"/>
+            </w:pPr>
+            <w:r>
+              <w:rPr>
+                <w:sz w:val="15"/>
+                <w:szCs w:val="15"/>
+                <w:rFonts w:ascii="Calibri" w:cs="Calibri" w:eastAsia="Calibri" w:hAnsi="Calibri"/>
+              </w:rPr>
+              <w:t xml:space="preserve">fusível ou disjuntor F2 no ramal, até o máximo do fabricante (ex.: 315 A gL/gG); F2 dedicado se a proteção a montante for maior</w:t>
+            </w:r>
+          </w:p>
+        </w:tc>
+        <w:tc>
+          <w:tcPr>
+            <w:tcW w:type="dxa" w:w="3902"/>
+            <w:tcMar>
+              <w:top w:type="dxa" w:w="30"/>
+              <w:left w:type="dxa" w:w="70"/>
+              <w:bottom w:type="dxa" w:w="30"/>
+              <w:right w:type="dxa" w:w="70"/>
+            </w:tcMar>
+          </w:tcPr>
+          <w:p>
+            <w:pPr>
+              <w:jc w:val="left"/>
+            </w:pPr>
+            <w:r>
+              <w:rPr>
+                <w:sz w:val="15"/>
+                <w:szCs w:val="15"/>
+                <w:rFonts w:ascii="Calibri" w:cs="Calibri" w:eastAsia="Calibri" w:hAnsi="Calibri"/>
+              </w:rPr>
+              <w:t xml:space="preserve">a própria proteção a montante, limitada ao máximo em V do fabricante (ex.: 125 A gL/gG)</w:t>
+            </w:r>
+          </w:p>
+        </w:tc>
+      </w:tr>
+      <w:tr>
+        <w:trPr>
+          <w:cantSplit/>
+        </w:trPr>
+        <w:tc>
+          <w:tcPr>
+            <w:tcW w:type="dxa" w:w="1951"/>
+            <w:tcMar>
+              <w:top w:type="dxa" w:w="30"/>
+              <w:left w:type="dxa" w:w="70"/>
+              <w:bottom w:type="dxa" w:w="30"/>
+              <w:right w:type="dxa" w:w="70"/>
+            </w:tcMar>
+          </w:tcPr>
+          <w:p>
+            <w:pPr>
+              <w:jc w:val="left"/>
+            </w:pPr>
+            <w:r>
+              <w:rPr>
+                <w:sz w:val="15"/>
+                <w:szCs w:val="15"/>
+                <w:rFonts w:ascii="Calibri" w:cs="Calibri" w:eastAsia="Calibri" w:hAnsi="Calibri"/>
+              </w:rPr>
+              <w:t xml:space="preserve">Falha do DPS</w:t>
+            </w:r>
+          </w:p>
+        </w:tc>
+        <w:tc>
+          <w:tcPr>
+            <w:tcW w:type="dxa" w:w="3902"/>
+            <w:tcMar>
+              <w:top w:type="dxa" w:w="30"/>
+              <w:left w:type="dxa" w:w="70"/>
+              <w:bottom w:type="dxa" w:w="30"/>
+              <w:right w:type="dxa" w:w="70"/>
+            </w:tcMar>
+          </w:tcPr>
+          <w:p>
+            <w:pPr>
+              <w:jc w:val="left"/>
+            </w:pPr>
+            <w:r>
+              <w:rPr>
+                <w:sz w:val="15"/>
+                <w:szCs w:val="15"/>
+                <w:rFonts w:ascii="Calibri" w:cs="Calibri" w:eastAsia="Calibri" w:hAnsi="Calibri"/>
+              </w:rPr>
+              <w:t xml:space="preserve">atua o F2: só o DPS sai de serviço — use a sinalização remota</w:t>
+            </w:r>
+          </w:p>
+        </w:tc>
+        <w:tc>
+          <w:tcPr>
+            <w:tcW w:type="dxa" w:w="3902"/>
+            <w:tcMar>
+              <w:top w:type="dxa" w:w="30"/>
+              <w:left w:type="dxa" w:w="70"/>
+              <w:bottom w:type="dxa" w:w="30"/>
+              <w:right w:type="dxa" w:w="70"/>
+            </w:tcMar>
+          </w:tcPr>
+          <w:p>
+            <w:pPr>
+              <w:jc w:val="left"/>
+            </w:pPr>
+            <w:r>
+              <w:rPr>
+                <w:sz w:val="15"/>
+                <w:szCs w:val="15"/>
+                <w:rFonts w:ascii="Calibri" w:cs="Calibri" w:eastAsia="Calibri" w:hAnsi="Calibri"/>
+              </w:rPr>
+              <w:t xml:space="preserve">atua a proteção a montante: desliga a instalação a jusante</w:t>
+            </w:r>
+          </w:p>
+        </w:tc>
+      </w:tr>
+      <w:tr>
+        <w:trPr>
+          <w:cantSplit/>
+        </w:trPr>
+        <w:tc>
+          <w:tcPr>
+            <w:tcW w:type="dxa" w:w="1951"/>
+            <w:tcMar>
+              <w:top w:type="dxa" w:w="30"/>
+              <w:left w:type="dxa" w:w="70"/>
+              <w:bottom w:type="dxa" w:w="30"/>
+              <w:right w:type="dxa" w:w="70"/>
+            </w:tcMar>
+          </w:tcPr>
+          <w:p>
+            <w:pPr>
+              <w:jc w:val="left"/>
+            </w:pPr>
+            <w:r>
+              <w:rPr>
+                <w:sz w:val="15"/>
+                <w:szCs w:val="15"/>
+                <w:rFonts w:ascii="Calibri" w:cs="Calibri" w:eastAsia="Calibri" w:hAnsi="Calibri"/>
+              </w:rPr>
+              <w:t xml:space="preserve">Seção dos condutores</w:t>
+            </w:r>
+          </w:p>
+        </w:tc>
+        <w:tc>
+          <w:tcPr>
+            <w:tcW w:type="dxa" w:w="3902"/>
+            <w:tcMar>
+              <w:top w:type="dxa" w:w="30"/>
+              <w:left w:type="dxa" w:w="70"/>
+              <w:bottom w:type="dxa" w:w="30"/>
+              <w:right w:type="dxa" w:w="70"/>
+            </w:tcMar>
+          </w:tcPr>
+          <w:p>
+            <w:pPr>
+              <w:jc w:val="left"/>
+            </w:pPr>
+            <w:r>
+              <w:rPr>
+                <w:sz w:val="15"/>
+                <w:szCs w:val="15"/>
+                <w:rFonts w:ascii="Calibri" w:cs="Calibri" w:eastAsia="Calibri" w:hAnsi="Calibri"/>
+              </w:rPr>
+              <w:t xml:space="preserve">Lq2 e Lq3 pela proteção a montante (tabela do fabricante)</w:t>
+            </w:r>
+          </w:p>
+        </w:tc>
+        <w:tc>
+          <w:tcPr>
+            <w:tcW w:type="dxa" w:w="3902"/>
+            <w:tcMar>
+              <w:top w:type="dxa" w:w="30"/>
+              <w:left w:type="dxa" w:w="70"/>
+              <w:bottom w:type="dxa" w:w="30"/>
+              <w:right w:type="dxa" w:w="70"/>
+            </w:tcMar>
+          </w:tcPr>
+          <w:p>
+            <w:pPr>
+              <w:jc w:val="left"/>
+            </w:pPr>
+            <w:r>
+              <w:rPr>
+                <w:sz w:val="15"/>
+                <w:szCs w:val="15"/>
+                <w:rFonts w:ascii="Calibri" w:cs="Calibri" w:eastAsia="Calibri" w:hAnsi="Calibri"/>
+              </w:rPr>
+              <w:t xml:space="preserve">o condutor do alimentador passa pelo borne: limitado à seção máxima do borne</w:t>
+            </w:r>
+          </w:p>
+        </w:tc>
+      </w:tr>
+      <w:tr>
+        <w:trPr>
+          <w:cantSplit/>
+        </w:trPr>
+        <w:tc>
+          <w:tcPr>
+            <w:tcW w:type="dxa" w:w="1951"/>
+            <w:tcMar>
+              <w:top w:type="dxa" w:w="30"/>
+              <w:left w:type="dxa" w:w="70"/>
+              <w:bottom w:type="dxa" w:w="30"/>
+              <w:right w:type="dxa" w:w="70"/>
+            </w:tcMar>
+          </w:tcPr>
+          <w:p>
+            <w:pPr>
+              <w:jc w:val="left"/>
+            </w:pPr>
+            <w:r>
+              <w:rPr>
+                <w:sz w:val="15"/>
+                <w:szCs w:val="15"/>
+                <w:rFonts w:ascii="Calibri" w:cs="Calibri" w:eastAsia="Calibri" w:hAnsi="Calibri"/>
+              </w:rPr>
+              <w:t xml:space="preserve">Uso típico</w:t>
+            </w:r>
+          </w:p>
+        </w:tc>
+        <w:tc>
+          <w:tcPr>
+            <w:tcW w:type="dxa" w:w="3902"/>
+            <w:tcMar>
+              <w:top w:type="dxa" w:w="30"/>
+              <w:left w:type="dxa" w:w="70"/>
+              <w:bottom w:type="dxa" w:w="30"/>
+              <w:right w:type="dxa" w:w="70"/>
+            </w:tcMar>
+          </w:tcPr>
+          <w:p>
+            <w:pPr>
+              <w:jc w:val="left"/>
+            </w:pPr>
+            <w:r>
+              <w:rPr>
+                <w:sz w:val="15"/>
+                <w:szCs w:val="15"/>
+                <w:rFonts w:ascii="Calibri" w:cs="Calibri" w:eastAsia="Calibri" w:hAnsi="Calibri"/>
+              </w:rPr>
+              <w:t xml:space="preserve">quadros de maior corrente ou sem espaço para passar o alimentador pelo DPS</w:t>
+            </w:r>
+          </w:p>
+        </w:tc>
+        <w:tc>
+          <w:tcPr>
+            <w:tcW w:type="dxa" w:w="3902"/>
+            <w:tcMar>
+              <w:top w:type="dxa" w:w="30"/>
+              <w:left w:type="dxa" w:w="70"/>
+              <w:bottom w:type="dxa" w:w="30"/>
+              <w:right w:type="dxa" w:w="70"/>
+            </w:tcMar>
+          </w:tcPr>
+          <w:p>
+            <w:pPr>
+              <w:jc w:val="left"/>
+            </w:pPr>
+            <w:r>
+              <w:rPr>
+                <w:sz w:val="15"/>
+                <w:szCs w:val="15"/>
+                <w:rFonts w:ascii="Calibri" w:cs="Calibri" w:eastAsia="Calibri" w:hAnsi="Calibri"/>
+              </w:rPr>
+              <w:t xml:space="preserve">quadros menores (residências, pequeno comércio), quando a + b ≤ 0,5 m não é viável</w:t>
+            </w:r>
+          </w:p>
+        </w:tc>
+      </w:tr>
+    </w:tbl>
+    <w:p>
+      <w:pPr>
+        <w:spacing w:after="80" w:before="0"/>
+      </w:pPr>
     </w:p>
     <w:p>
       <w:pPr>
@@ -4509,7 +5280,7 @@
           <w:szCs w:val="16"/>
           <w:rFonts w:ascii="Calibri" w:cs="Calibri" w:eastAsia="Calibri" w:hAnsi="Calibri"/>
         </w:rPr>
-        <w:t xml:space="preserve">Esquema 1 — neutro aterrado no BEP. TN-C-S no quadro de entrada (PEN separado no BEP): DPS só nas fases, ligados ao BEP.</w:t>
+        <w:t xml:space="preserve">Ligação em T (paralelo) com retaguarda F2. O DPS fica num ramal com fusível próprio; a + b ≤ 0,5 m; a atuação de F2 tira só o DPS de serviço — use a sinalização remota.</w:t>
       </w:r>
     </w:p>
     <w:p>
@@ -4569,7 +5340,41 @@
           <w:szCs w:val="16"/>
           <w:rFonts w:ascii="Calibri" w:cs="Calibri" w:eastAsia="Calibri" w:hAnsi="Calibri"/>
         </w:rPr>
-        <w:t xml:space="preserve">Esquema 2 — n+0 (fases e neutro ao PE). TN-S e TT a jusante do DR: um DPS por condutor vivo, todos ao PE.</w:t>
+        <w:t xml:space="preserve">Ligação em V (série). O condutor entra e sai pelos bornes do DPS: ΔU desprezível; protegido pelo F1 dentro do limite do fabricante.</w:t>
+      </w:r>
+    </w:p>
+    <w:p>
+      <w:pPr>
+        <w:pStyle w:val="Heading1"/>
+        <w:keepNext/>
+        <w:pBdr>
+          <w:bottom w:val="single" w:color="B9C3CB" w:sz="4"/>
+        </w:pBdr>
+        <w:spacing w:before="320" w:after="140"/>
+      </w:pPr>
+      <w:r>
+        <w:rPr>
+          <w:b/>
+          <w:bCs/>
+          <w:color w:val="0B5A70"/>
+          <w:sz w:val="26"/>
+          <w:szCs w:val="26"/>
+          <w:rFonts w:ascii="Calibri" w:cs="Calibri" w:eastAsia="Calibri" w:hAnsi="Calibri"/>
+        </w:rPr>
+        <w:t xml:space="preserve">9. FORMAS DE LIGAÇÃO DOS DPS (FIGURA 13)</w:t>
+      </w:r>
+    </w:p>
+    <w:p>
+      <w:pPr>
+        <w:spacing w:after="100" w:before="0"/>
+      </w:pPr>
+      <w:r>
+        <w:rPr>
+          <w:sz w:val="20"/>
+          <w:szCs w:val="20"/>
+          <w:rFonts w:ascii="Calibri" w:cs="Calibri" w:eastAsia="Calibri" w:hAnsi="Calibri"/>
+        </w:rPr>
+        <w:t xml:space="preserve">A NBR 5410 (Figura 13) define três esquemas de conexão conforme o neutro e o esquema de aterramento: neutro aterrado no BEP — DPS só nas fases (esquema 1); DPS entre cada condutor vivo e o PE (esquema 2); DPS entre fases e neutro e centelhador entre neutro e PE (esquema 3). O esquema adotado em cada quadro está na seção de seleção.</w:t>
       </w:r>
     </w:p>
     <w:p>
@@ -4629,7 +5434,7 @@
           <w:szCs w:val="16"/>
           <w:rFonts w:ascii="Calibri" w:cs="Calibri" w:eastAsia="Calibri" w:hAnsi="Calibri"/>
         </w:rPr>
-        <w:t xml:space="preserve">Esquema 3 — n+1 (fases ao neutro e centelhador N–PE). TT a montante do DR (3+1): o centelhador N–PE recebe a soma das correntes.</w:t>
+        <w:t xml:space="preserve">Esquema 1 — neutro aterrado no BEP. TN-C-S no quadro de entrada (PEN separado no BEP): DPS só nas fases, ligados ao BEP.</w:t>
       </w:r>
     </w:p>
     <w:p>
@@ -4689,7 +5494,7 @@
           <w:szCs w:val="16"/>
           <w:rFonts w:ascii="Calibri" w:cs="Calibri" w:eastAsia="Calibri" w:hAnsi="Calibri"/>
         </w:rPr>
-        <w:t xml:space="preserve">Ligação em T (paralelo) com retaguarda F2. O DPS fica num ramal com fusível próprio; a + b ≤ 0,5 m; a atuação de F2 tira só o DPS de serviço — use a sinalização remota.</w:t>
+        <w:t xml:space="preserve">Esquema 2 — n+0 (fases e neutro ao PE). TN-S e TT a jusante do DR: um DPS por condutor vivo, todos ao PE.</w:t>
       </w:r>
     </w:p>
     <w:p>
@@ -4749,7 +5554,7 @@
           <w:szCs w:val="16"/>
           <w:rFonts w:ascii="Calibri" w:cs="Calibri" w:eastAsia="Calibri" w:hAnsi="Calibri"/>
         </w:rPr>
-        <w:t xml:space="preserve">Ligação em V (série). O condutor entra e sai pelos bornes do DPS: ΔU desprezível; protegido pelo F1 dentro do limite do fabricante.</w:t>
+        <w:t xml:space="preserve">Esquema 3 — n+1 (fases ao neutro e centelhador N–PE). TT a montante do DR (3+1): o centelhador N–PE recebe a soma das correntes.</w:t>
       </w:r>
     </w:p>
     <w:p>
@@ -4770,7 +5575,20 @@
           <w:szCs w:val="26"/>
           <w:rFonts w:ascii="Calibri" w:cs="Calibri" w:eastAsia="Calibri" w:hAnsi="Calibri"/>
         </w:rPr>
-        <w:t xml:space="preserve">9. INSTALAÇÃO</w:t>
+        <w:t xml:space="preserve">10. EQUIPOTENCIALIZAÇÃO PRINCIPAL (BEP)</w:t>
+      </w:r>
+    </w:p>
+    <w:p>
+      <w:pPr>
+        <w:spacing w:after="100" w:before="0"/>
+      </w:pPr>
+      <w:r>
+        <w:rPr>
+          <w:sz w:val="20"/>
+          <w:szCs w:val="20"/>
+          <w:rFonts w:ascii="Calibri" w:cs="Calibri" w:eastAsia="Calibri" w:hAnsi="Calibri"/>
+        </w:rPr>
+        <w:t xml:space="preserve">O barramento de equipotencialização principal (BEP) fica junto ou próximo do ponto de entrada da alimentação. Neste projeto: a barra PE do quadro de entrada acumula a função de BEP — DPS ligados ao BEP. Pela nota a da Figura 13 da NBR 5410, os DPS são ligados ao BEP quando instalados junto a ele ou quando a barra PE do quadro principal acumula a função de BEP, e à barra PE do quadro quando ela não é o BEP.</w:t>
       </w:r>
     </w:p>
     <w:p>
@@ -4788,7 +5606,7 @@
           <w:szCs w:val="19"/>
           <w:rFonts w:ascii="Calibri" w:cs="Calibri" w:eastAsia="Calibri" w:hAnsi="Calibri"/>
         </w:rPr>
-        <w:t xml:space="preserve">Instalar os DPS junto ao barramento de proteção do quadro, com condutores curtos, retilíneos e sem laços; preferir a ligação em V (entrada e saída nos mesmos bornes) quando o comprimento passar de 0,5 m.</w:t>
+        <w:t xml:space="preserve">Condutor de aterramento, do eletrodo ao BEP — Padrão de entrada — categoria T3 (NDU 001), 16 mm² Cu, R = 16,3 Ω.</w:t>
       </w:r>
     </w:p>
     <w:p>
@@ -4806,7 +5624,7 @@
           <w:szCs w:val="19"/>
           <w:rFonts w:ascii="Calibri" w:cs="Calibri" w:eastAsia="Calibri" w:hAnsi="Calibri"/>
         </w:rPr>
-        <w:t xml:space="preserve">Manter separados os condutores de chegada (não protegidos) e os condutores já protegidos que saem do quadro, sem percursos paralelos próximos, para evitar o reacoplamento do surto.</w:t>
+        <w:t xml:space="preserve">Condutor(es) de proteção principal(is) da instalação — barra PE dos quadros.</w:t>
       </w:r>
     </w:p>
     <w:p>
@@ -4824,7 +5642,7 @@
           <w:szCs w:val="19"/>
           <w:rFonts w:ascii="Calibri" w:cs="Calibri" w:eastAsia="Calibri" w:hAnsi="Calibri"/>
         </w:rPr>
-        <w:t xml:space="preserve">Proteger cada conjunto de DPS pela retaguarda indicada pelo fabricante (de preferência fusível gL/gG), com indicação de fim de vida visível; na ligação em paralelo, ligar o contato de sinalização remota, pois a atuação da retaguarda tira o DPS de serviço sem desligar a instalação.</w:t>
+        <w:t xml:space="preserve">Neutro da alimentação (PE da rede ligado ao BEP).</w:t>
       </w:r>
     </w:p>
     <w:p>
@@ -4842,7 +5660,7 @@
           <w:szCs w:val="19"/>
           <w:rFonts w:ascii="Calibri" w:cs="Calibri" w:eastAsia="Calibri" w:hAnsi="Calibri"/>
         </w:rPr>
-        <w:t xml:space="preserve">Interligar o barramento PE dos quadros ao BEP; com SPDA, ligar o DPS de entrada ao BEP pelo caminho mais curto. Equipotencializar no BEP todas as linhas e tubulações metálicas que entram na edificação.</w:t>
+        <w:t xml:space="preserve">DPS das linhas de energia (ligados ao BEP) e DPS das linhas de sinal que entram na edificação.</w:t>
       </w:r>
     </w:p>
     <w:p>
@@ -4860,7 +5678,598 @@
           <w:szCs w:val="19"/>
           <w:rFonts w:ascii="Calibri" w:cs="Calibri" w:eastAsia="Calibri" w:hAnsi="Calibri"/>
         </w:rPr>
-        <w:t xml:space="preserve">Inspecionar os DPS periodicamente e após descargas atmosféricas na região, substituindo os módulos sinalizados.</w:t>
+        <w:t xml:space="preserve">Tubulações metálicas de água, gás, esgoto e ar-condicionado; condutos, blindagens e capas metálicas de cabos que entram ou saem da edificação.</w:t>
+      </w:r>
+    </w:p>
+    <w:p>
+      <w:pPr>
+        <w:pStyle w:val="ListParagraph"/>
+        <w:numPr>
+          <w:ilvl w:val="0"/>
+          <w:numId w:val="1"/>
+        </w:numPr>
+        <w:spacing w:after="40"/>
+      </w:pPr>
+      <w:r>
+        <w:rPr>
+          <w:sz w:val="19"/>
+          <w:szCs w:val="19"/>
+          <w:rFonts w:ascii="Calibri" w:cs="Calibri" w:eastAsia="Calibri" w:hAnsi="Calibri"/>
+        </w:rPr>
+        <w:t xml:space="preserve">Armaduras do concreto e demais elementos estruturais metálicos.</w:t>
+      </w:r>
+    </w:p>
+    <w:p>
+      <w:pPr>
+        <w:pStyle w:val="ListParagraph"/>
+        <w:numPr>
+          <w:ilvl w:val="0"/>
+          <w:numId w:val="1"/>
+        </w:numPr>
+        <w:spacing w:after="40"/>
+      </w:pPr>
+      <w:r>
+        <w:rPr>
+          <w:sz w:val="19"/>
+          <w:szCs w:val="19"/>
+          <w:rFonts w:ascii="Calibri" w:cs="Calibri" w:eastAsia="Calibri" w:hAnsi="Calibri"/>
+        </w:rPr>
+        <w:t xml:space="preserve">Subsistema de aterramento do SPDA (anel, arranjo B) e descidas, interligados ao BEP — equipotencialização para descargas atmosféricas (NBR 5419-3).</w:t>
+      </w:r>
+    </w:p>
+    <w:tbl>
+      <w:tblPr>
+        <w:tblW w:type="pct" w:w="100%"/>
+        <w:tblBorders>
+          <w:top w:val="single" w:color="auto" w:sz="4"/>
+          <w:left w:val="single" w:color="auto" w:sz="4"/>
+          <w:bottom w:val="single" w:color="auto" w:sz="4"/>
+          <w:right w:val="single" w:color="auto" w:sz="4"/>
+          <w:insideH w:val="single" w:color="auto" w:sz="4"/>
+          <w:insideV w:val="single" w:color="auto" w:sz="4"/>
+        </w:tblBorders>
+        <w:tblLayout w:type="fixed"/>
+      </w:tblPr>
+      <w:tblGrid>
+        <w:gridCol w:w="4488"/>
+        <w:gridCol w:w="2146"/>
+        <w:gridCol w:w="3122"/>
+      </w:tblGrid>
+      <w:tr>
+        <w:trPr>
+          <w:tblHeader/>
+        </w:trPr>
+        <w:tc>
+          <w:tcPr>
+            <w:tcW w:type="dxa" w:w="4488"/>
+            <w:shd w:fill="E7EDF1" w:color="auto" w:val="clear"/>
+            <w:tcMar>
+              <w:top w:type="dxa" w:w="30"/>
+              <w:left w:type="dxa" w:w="70"/>
+              <w:bottom w:type="dxa" w:w="30"/>
+              <w:right w:type="dxa" w:w="70"/>
+            </w:tcMar>
+          </w:tcPr>
+          <w:p>
+            <w:pPr>
+              <w:jc w:val="left"/>
+            </w:pPr>
+            <w:r>
+              <w:rPr>
+                <w:b/>
+                <w:bCs/>
+                <w:sz w:val="17"/>
+                <w:szCs w:val="17"/>
+                <w:rFonts w:ascii="Calibri" w:cs="Calibri" w:eastAsia="Calibri" w:hAnsi="Calibri"/>
+              </w:rPr>
+              <w:t xml:space="preserve">Condutor</w:t>
+            </w:r>
+          </w:p>
+        </w:tc>
+        <w:tc>
+          <w:tcPr>
+            <w:tcW w:type="dxa" w:w="2146"/>
+            <w:shd w:fill="E7EDF1" w:color="auto" w:val="clear"/>
+            <w:tcMar>
+              <w:top w:type="dxa" w:w="30"/>
+              <w:left w:type="dxa" w:w="70"/>
+              <w:bottom w:type="dxa" w:w="30"/>
+              <w:right w:type="dxa" w:w="70"/>
+            </w:tcMar>
+          </w:tcPr>
+          <w:p>
+            <w:pPr>
+              <w:jc w:val="left"/>
+            </w:pPr>
+            <w:r>
+              <w:rPr>
+                <w:b/>
+                <w:bCs/>
+                <w:sz w:val="17"/>
+                <w:szCs w:val="17"/>
+                <w:rFonts w:ascii="Calibri" w:cs="Calibri" w:eastAsia="Calibri" w:hAnsi="Calibri"/>
+              </w:rPr>
+              <w:t xml:space="preserve">Seção mínima (cobre)</w:t>
+            </w:r>
+          </w:p>
+        </w:tc>
+        <w:tc>
+          <w:tcPr>
+            <w:tcW w:type="dxa" w:w="3122"/>
+            <w:shd w:fill="E7EDF1" w:color="auto" w:val="clear"/>
+            <w:tcMar>
+              <w:top w:type="dxa" w:w="30"/>
+              <w:left w:type="dxa" w:w="70"/>
+              <w:bottom w:type="dxa" w:w="30"/>
+              <w:right w:type="dxa" w:w="70"/>
+            </w:tcMar>
+          </w:tcPr>
+          <w:p>
+            <w:pPr>
+              <w:jc w:val="left"/>
+            </w:pPr>
+            <w:r>
+              <w:rPr>
+                <w:b/>
+                <w:bCs/>
+                <w:sz w:val="17"/>
+                <w:szCs w:val="17"/>
+                <w:rFonts w:ascii="Calibri" w:cs="Calibri" w:eastAsia="Calibri" w:hAnsi="Calibri"/>
+              </w:rPr>
+              <w:t xml:space="preserve">Referência</w:t>
+            </w:r>
+          </w:p>
+        </w:tc>
+      </w:tr>
+      <w:tr>
+        <w:trPr>
+          <w:cantSplit/>
+        </w:trPr>
+        <w:tc>
+          <w:tcPr>
+            <w:tcW w:type="dxa" w:w="4488"/>
+            <w:tcMar>
+              <w:top w:type="dxa" w:w="30"/>
+              <w:left w:type="dxa" w:w="70"/>
+              <w:bottom w:type="dxa" w:w="30"/>
+              <w:right w:type="dxa" w:w="70"/>
+            </w:tcMar>
+          </w:tcPr>
+          <w:p>
+            <w:pPr>
+              <w:jc w:val="left"/>
+            </w:pPr>
+            <w:r>
+              <w:rPr>
+                <w:sz w:val="17"/>
+                <w:szCs w:val="17"/>
+                <w:rFonts w:ascii="Calibri" w:cs="Calibri" w:eastAsia="Calibri" w:hAnsi="Calibri"/>
+              </w:rPr>
+              <w:t xml:space="preserve">Equipotencialização principal (ao BEP)</w:t>
+            </w:r>
+          </w:p>
+        </w:tc>
+        <w:tc>
+          <w:tcPr>
+            <w:tcW w:type="dxa" w:w="2146"/>
+            <w:tcMar>
+              <w:top w:type="dxa" w:w="30"/>
+              <w:left w:type="dxa" w:w="70"/>
+              <w:bottom w:type="dxa" w:w="30"/>
+              <w:right w:type="dxa" w:w="70"/>
+            </w:tcMar>
+          </w:tcPr>
+          <w:p>
+            <w:pPr>
+              <w:jc w:val="left"/>
+            </w:pPr>
+            <w:r>
+              <w:rPr>
+                <w:sz w:val="17"/>
+                <w:szCs w:val="17"/>
+                <w:rFonts w:ascii="Calibri" w:cs="Calibri" w:eastAsia="Calibri" w:hAnsi="Calibri"/>
+              </w:rPr>
+              <w:t xml:space="preserve">10 mm²</w:t>
+            </w:r>
+          </w:p>
+        </w:tc>
+        <w:tc>
+          <w:tcPr>
+            <w:tcW w:type="dxa" w:w="3122"/>
+            <w:tcMar>
+              <w:top w:type="dxa" w:w="30"/>
+              <w:left w:type="dxa" w:w="70"/>
+              <w:bottom w:type="dxa" w:w="30"/>
+              <w:right w:type="dxa" w:w="70"/>
+            </w:tcMar>
+          </w:tcPr>
+          <w:p>
+            <w:pPr>
+              <w:jc w:val="left"/>
+            </w:pPr>
+            <w:r>
+              <w:rPr>
+                <w:sz w:val="17"/>
+                <w:szCs w:val="17"/>
+                <w:rFonts w:ascii="Calibri" w:cs="Calibri" w:eastAsia="Calibri" w:hAnsi="Calibri"/>
+              </w:rPr>
+              <w:t xml:space="preserve">NBR 5410 — metade do maior PE (16 mm²), mínimo 6 mm², até 25 mm²</w:t>
+            </w:r>
+          </w:p>
+        </w:tc>
+      </w:tr>
+      <w:tr>
+        <w:trPr>
+          <w:cantSplit/>
+        </w:trPr>
+        <w:tc>
+          <w:tcPr>
+            <w:tcW w:type="dxa" w:w="4488"/>
+            <w:tcMar>
+              <w:top w:type="dxa" w:w="30"/>
+              <w:left w:type="dxa" w:w="70"/>
+              <w:bottom w:type="dxa" w:w="30"/>
+              <w:right w:type="dxa" w:w="70"/>
+            </w:tcMar>
+          </w:tcPr>
+          <w:p>
+            <w:pPr>
+              <w:jc w:val="left"/>
+            </w:pPr>
+            <w:r>
+              <w:rPr>
+                <w:sz w:val="17"/>
+                <w:szCs w:val="17"/>
+                <w:rFonts w:ascii="Calibri" w:cs="Calibri" w:eastAsia="Calibri" w:hAnsi="Calibri"/>
+              </w:rPr>
+              <w:t xml:space="preserve">Condutor de aterramento (eletrodo → BEP)</w:t>
+            </w:r>
+          </w:p>
+        </w:tc>
+        <w:tc>
+          <w:tcPr>
+            <w:tcW w:type="dxa" w:w="2146"/>
+            <w:tcMar>
+              <w:top w:type="dxa" w:w="30"/>
+              <w:left w:type="dxa" w:w="70"/>
+              <w:bottom w:type="dxa" w:w="30"/>
+              <w:right w:type="dxa" w:w="70"/>
+            </w:tcMar>
+          </w:tcPr>
+          <w:p>
+            <w:pPr>
+              <w:jc w:val="left"/>
+            </w:pPr>
+            <w:r>
+              <w:rPr>
+                <w:sz w:val="17"/>
+                <w:szCs w:val="17"/>
+                <w:rFonts w:ascii="Calibri" w:cs="Calibri" w:eastAsia="Calibri" w:hAnsi="Calibri"/>
+              </w:rPr>
+              <w:t xml:space="preserve">16 mm²</w:t>
+            </w:r>
+          </w:p>
+        </w:tc>
+        <w:tc>
+          <w:tcPr>
+            <w:tcW w:type="dxa" w:w="3122"/>
+            <w:tcMar>
+              <w:top w:type="dxa" w:w="30"/>
+              <w:left w:type="dxa" w:w="70"/>
+              <w:bottom w:type="dxa" w:w="30"/>
+              <w:right w:type="dxa" w:w="70"/>
+            </w:tcMar>
+          </w:tcPr>
+          <w:p>
+            <w:pPr>
+              <w:jc w:val="left"/>
+            </w:pPr>
+            <w:r>
+              <w:rPr>
+                <w:sz w:val="17"/>
+                <w:szCs w:val="17"/>
+                <w:rFonts w:ascii="Calibri" w:cs="Calibri" w:eastAsia="Calibri" w:hAnsi="Calibri"/>
+              </w:rPr>
+              <w:t xml:space="preserve">adotado no projeto de aterramento</w:t>
+            </w:r>
+          </w:p>
+        </w:tc>
+      </w:tr>
+      <w:tr>
+        <w:trPr>
+          <w:cantSplit/>
+        </w:trPr>
+        <w:tc>
+          <w:tcPr>
+            <w:tcW w:type="dxa" w:w="4488"/>
+            <w:tcMar>
+              <w:top w:type="dxa" w:w="30"/>
+              <w:left w:type="dxa" w:w="70"/>
+              <w:bottom w:type="dxa" w:w="30"/>
+              <w:right w:type="dxa" w:w="70"/>
+            </w:tcMar>
+          </w:tcPr>
+          <w:p>
+            <w:pPr>
+              <w:jc w:val="left"/>
+            </w:pPr>
+            <w:r>
+              <w:rPr>
+                <w:sz w:val="17"/>
+                <w:szCs w:val="17"/>
+                <w:rFonts w:ascii="Calibri" w:cs="Calibri" w:eastAsia="Calibri" w:hAnsi="Calibri"/>
+              </w:rPr>
+              <w:t xml:space="preserve">Entre barramentos e ao subsistema de aterramento</w:t>
+            </w:r>
+          </w:p>
+        </w:tc>
+        <w:tc>
+          <w:tcPr>
+            <w:tcW w:type="dxa" w:w="2146"/>
+            <w:tcMar>
+              <w:top w:type="dxa" w:w="30"/>
+              <w:left w:type="dxa" w:w="70"/>
+              <w:bottom w:type="dxa" w:w="30"/>
+              <w:right w:type="dxa" w:w="70"/>
+            </w:tcMar>
+          </w:tcPr>
+          <w:p>
+            <w:pPr>
+              <w:jc w:val="left"/>
+            </w:pPr>
+            <w:r>
+              <w:rPr>
+                <w:sz w:val="17"/>
+                <w:szCs w:val="17"/>
+                <w:rFonts w:ascii="Calibri" w:cs="Calibri" w:eastAsia="Calibri" w:hAnsi="Calibri"/>
+              </w:rPr>
+              <w:t xml:space="preserve">16 mm²</w:t>
+            </w:r>
+          </w:p>
+        </w:tc>
+        <w:tc>
+          <w:tcPr>
+            <w:tcW w:type="dxa" w:w="3122"/>
+            <w:tcMar>
+              <w:top w:type="dxa" w:w="30"/>
+              <w:left w:type="dxa" w:w="70"/>
+              <w:bottom w:type="dxa" w:w="30"/>
+              <w:right w:type="dxa" w:w="70"/>
+            </w:tcMar>
+          </w:tcPr>
+          <w:p>
+            <w:pPr>
+              <w:jc w:val="left"/>
+            </w:pPr>
+            <w:r>
+              <w:rPr>
+                <w:sz w:val="17"/>
+                <w:szCs w:val="17"/>
+                <w:rFonts w:ascii="Calibri" w:cs="Calibri" w:eastAsia="Calibri" w:hAnsi="Calibri"/>
+              </w:rPr>
+              <w:t xml:space="preserve">NBR 5419-3 (com SPDA)</w:t>
+            </w:r>
+          </w:p>
+        </w:tc>
+      </w:tr>
+      <w:tr>
+        <w:trPr>
+          <w:cantSplit/>
+        </w:trPr>
+        <w:tc>
+          <w:tcPr>
+            <w:tcW w:type="dxa" w:w="4488"/>
+            <w:tcMar>
+              <w:top w:type="dxa" w:w="30"/>
+              <w:left w:type="dxa" w:w="70"/>
+              <w:bottom w:type="dxa" w:w="30"/>
+              <w:right w:type="dxa" w:w="70"/>
+            </w:tcMar>
+          </w:tcPr>
+          <w:p>
+            <w:pPr>
+              <w:jc w:val="left"/>
+            </w:pPr>
+            <w:r>
+              <w:rPr>
+                <w:sz w:val="17"/>
+                <w:szCs w:val="17"/>
+                <w:rFonts w:ascii="Calibri" w:cs="Calibri" w:eastAsia="Calibri" w:hAnsi="Calibri"/>
+              </w:rPr>
+              <w:t xml:space="preserve">Instalações metálicas internas ao barramento</w:t>
+            </w:r>
+          </w:p>
+        </w:tc>
+        <w:tc>
+          <w:tcPr>
+            <w:tcW w:type="dxa" w:w="2146"/>
+            <w:tcMar>
+              <w:top w:type="dxa" w:w="30"/>
+              <w:left w:type="dxa" w:w="70"/>
+              <w:bottom w:type="dxa" w:w="30"/>
+              <w:right w:type="dxa" w:w="70"/>
+            </w:tcMar>
+          </w:tcPr>
+          <w:p>
+            <w:pPr>
+              <w:jc w:val="left"/>
+            </w:pPr>
+            <w:r>
+              <w:rPr>
+                <w:sz w:val="17"/>
+                <w:szCs w:val="17"/>
+                <w:rFonts w:ascii="Calibri" w:cs="Calibri" w:eastAsia="Calibri" w:hAnsi="Calibri"/>
+              </w:rPr>
+              <w:t xml:space="preserve">6 mm²</w:t>
+            </w:r>
+          </w:p>
+        </w:tc>
+        <w:tc>
+          <w:tcPr>
+            <w:tcW w:type="dxa" w:w="3122"/>
+            <w:tcMar>
+              <w:top w:type="dxa" w:w="30"/>
+              <w:left w:type="dxa" w:w="70"/>
+              <w:bottom w:type="dxa" w:w="30"/>
+              <w:right w:type="dxa" w:w="70"/>
+            </w:tcMar>
+          </w:tcPr>
+          <w:p>
+            <w:pPr>
+              <w:jc w:val="left"/>
+            </w:pPr>
+            <w:r>
+              <w:rPr>
+                <w:sz w:val="17"/>
+                <w:szCs w:val="17"/>
+                <w:rFonts w:ascii="Calibri" w:cs="Calibri" w:eastAsia="Calibri" w:hAnsi="Calibri"/>
+              </w:rPr>
+              <w:t xml:space="preserve">NBR 5419-3 (com SPDA)</w:t>
+            </w:r>
+          </w:p>
+        </w:tc>
+      </w:tr>
+      <w:tr>
+        <w:trPr>
+          <w:cantSplit/>
+        </w:trPr>
+        <w:tc>
+          <w:tcPr>
+            <w:tcW w:type="dxa" w:w="4488"/>
+            <w:tcMar>
+              <w:top w:type="dxa" w:w="30"/>
+              <w:left w:type="dxa" w:w="70"/>
+              <w:bottom w:type="dxa" w:w="30"/>
+              <w:right w:type="dxa" w:w="70"/>
+            </w:tcMar>
+          </w:tcPr>
+          <w:p>
+            <w:pPr>
+              <w:jc w:val="left"/>
+            </w:pPr>
+            <w:r>
+              <w:rPr>
+                <w:sz w:val="17"/>
+                <w:szCs w:val="17"/>
+                <w:rFonts w:ascii="Calibri" w:cs="Calibri" w:eastAsia="Calibri" w:hAnsi="Calibri"/>
+              </w:rPr>
+              <w:t xml:space="preserve">DPS de entrada ao BEP / barra PE</w:t>
+            </w:r>
+          </w:p>
+        </w:tc>
+        <w:tc>
+          <w:tcPr>
+            <w:tcW w:type="dxa" w:w="2146"/>
+            <w:tcMar>
+              <w:top w:type="dxa" w:w="30"/>
+              <w:left w:type="dxa" w:w="70"/>
+              <w:bottom w:type="dxa" w:w="30"/>
+              <w:right w:type="dxa" w:w="70"/>
+            </w:tcMar>
+          </w:tcPr>
+          <w:p>
+            <w:pPr>
+              <w:jc w:val="left"/>
+            </w:pPr>
+            <w:r>
+              <w:rPr>
+                <w:sz w:val="17"/>
+                <w:szCs w:val="17"/>
+                <w:rFonts w:ascii="Calibri" w:cs="Calibri" w:eastAsia="Calibri" w:hAnsi="Calibri"/>
+              </w:rPr>
+              <w:t xml:space="preserve">16 mm²</w:t>
+            </w:r>
+          </w:p>
+        </w:tc>
+        <w:tc>
+          <w:tcPr>
+            <w:tcW w:type="dxa" w:w="3122"/>
+            <w:tcMar>
+              <w:top w:type="dxa" w:w="30"/>
+              <w:left w:type="dxa" w:w="70"/>
+              <w:bottom w:type="dxa" w:w="30"/>
+              <w:right w:type="dxa" w:w="70"/>
+            </w:tcMar>
+          </w:tcPr>
+          <w:p>
+            <w:pPr>
+              <w:jc w:val="left"/>
+            </w:pPr>
+            <w:r>
+              <w:rPr>
+                <w:sz w:val="17"/>
+                <w:szCs w:val="17"/>
+                <w:rFonts w:ascii="Calibri" w:cs="Calibri" w:eastAsia="Calibri" w:hAnsi="Calibri"/>
+              </w:rPr>
+              <w:t xml:space="preserve">NBR 5410 e fabricante — condutor ≤ 0,5 m</w:t>
+            </w:r>
+          </w:p>
+        </w:tc>
+      </w:tr>
+    </w:tbl>
+    <w:p>
+      <w:pPr>
+        <w:spacing w:after="80" w:before="0"/>
+      </w:pPr>
+    </w:p>
+    <w:p>
+      <w:pPr>
+        <w:keepNext/>
+        <w:spacing w:before="60" w:after="20"/>
+      </w:pPr>
+      <w:r>
+        <w:drawing>
+          <wp:inline distT="0" distB="0" distL="0" distR="0">
+            <wp:extent cx="6096000" cy="4391025"/>
+            <wp:effectExtent t="0" r="0" b="0" l="0"/>
+            <wp:docPr id="1" name="" descr="" title=""/>
+            <wp:cNvGraphicFramePr>
+              <a:graphicFrameLocks xmlns:a="http://schemas.openxmlformats.org/drawingml/2006/main" noChangeAspect="1"/>
+            </wp:cNvGraphicFramePr>
+            <a:graphic xmlns:a="http://schemas.openxmlformats.org/drawingml/2006/main">
+              <a:graphicData uri="http://schemas.openxmlformats.org/drawingml/2006/picture">
+                <pic:pic xmlns:pic="http://schemas.openxmlformats.org/drawingml/2006/picture">
+                  <pic:nvPicPr>
+                    <pic:cNvPr id="0" name="" descr=""/>
+                    <pic:cNvPicPr>
+                      <a:picLocks noChangeAspect="1" noChangeArrowheads="1"/>
+                    </pic:cNvPicPr>
+                  </pic:nvPicPr>
+                  <pic:blipFill>
+                    <a:blip r:embed="rId16" cstate="none"/>
+                    <a:srcRect/>
+                    <a:stretch>
+                      <a:fillRect/>
+                    </a:stretch>
+                  </pic:blipFill>
+                  <pic:spPr bwMode="auto">
+                    <a:xfrm>
+                      <a:off x="0" y="0"/>
+                      <a:ext cx="6096000" cy="4391025"/>
+                    </a:xfrm>
+                    <a:prstGeom prst="rect">
+                      <a:avLst/>
+                    </a:prstGeom>
+                  </pic:spPr>
+                </pic:pic>
+              </a:graphicData>
+            </a:graphic>
+          </wp:inline>
+        </w:drawing>
+      </w:r>
+    </w:p>
+    <w:p>
+      <w:pPr>
+        <w:spacing w:after="100" w:before="0"/>
+      </w:pPr>
+      <w:r>
+        <w:rPr>
+          <w:color w:val="56606A"/>
+          <w:sz w:val="16"/>
+          <w:szCs w:val="16"/>
+          <w:rFonts w:ascii="Calibri" w:cs="Calibri" w:eastAsia="Calibri" w:hAnsi="Calibri"/>
+        </w:rPr>
+        <w:t xml:space="preserve">Equipotencialização principal: eletrodo de aterramento, BEP, DPS de entrada ligados ao BEP, linha de sinal com DPS no DG, tubulações metálicas e armaduras, com o anel de aterramento e a descida do SPDA.</w:t>
       </w:r>
     </w:p>
     <w:p>
@@ -4881,7 +6290,118 @@
           <w:szCs w:val="26"/>
           <w:rFonts w:ascii="Calibri" w:cs="Calibri" w:eastAsia="Calibri" w:hAnsi="Calibri"/>
         </w:rPr>
-        <w:t xml:space="preserve">10. CONCLUSÃO</w:t>
+        <w:t xml:space="preserve">11. INSTALAÇÃO</w:t>
+      </w:r>
+    </w:p>
+    <w:p>
+      <w:pPr>
+        <w:pStyle w:val="ListParagraph"/>
+        <w:numPr>
+          <w:ilvl w:val="0"/>
+          <w:numId w:val="1"/>
+        </w:numPr>
+        <w:spacing w:after="40"/>
+      </w:pPr>
+      <w:r>
+        <w:rPr>
+          <w:sz w:val="19"/>
+          <w:szCs w:val="19"/>
+          <w:rFonts w:ascii="Calibri" w:cs="Calibri" w:eastAsia="Calibri" w:hAnsi="Calibri"/>
+        </w:rPr>
+        <w:t xml:space="preserve">Instalar os DPS junto ao barramento de proteção do quadro, com condutores curtos, retilíneos e sem laços; preferir a ligação em V (entrada e saída nos mesmos bornes) quando o comprimento passar de 0,5 m.</w:t>
+      </w:r>
+    </w:p>
+    <w:p>
+      <w:pPr>
+        <w:pStyle w:val="ListParagraph"/>
+        <w:numPr>
+          <w:ilvl w:val="0"/>
+          <w:numId w:val="1"/>
+        </w:numPr>
+        <w:spacing w:after="40"/>
+      </w:pPr>
+      <w:r>
+        <w:rPr>
+          <w:sz w:val="19"/>
+          <w:szCs w:val="19"/>
+          <w:rFonts w:ascii="Calibri" w:cs="Calibri" w:eastAsia="Calibri" w:hAnsi="Calibri"/>
+        </w:rPr>
+        <w:t xml:space="preserve">Manter separados os condutores de chegada (não protegidos) e os condutores já protegidos que saem do quadro, sem percursos paralelos próximos, para evitar o reacoplamento do surto.</w:t>
+      </w:r>
+    </w:p>
+    <w:p>
+      <w:pPr>
+        <w:pStyle w:val="ListParagraph"/>
+        <w:numPr>
+          <w:ilvl w:val="0"/>
+          <w:numId w:val="1"/>
+        </w:numPr>
+        <w:spacing w:after="40"/>
+      </w:pPr>
+      <w:r>
+        <w:rPr>
+          <w:sz w:val="19"/>
+          <w:szCs w:val="19"/>
+          <w:rFonts w:ascii="Calibri" w:cs="Calibri" w:eastAsia="Calibri" w:hAnsi="Calibri"/>
+        </w:rPr>
+        <w:t xml:space="preserve">Proteger cada conjunto de DPS pela retaguarda indicada pelo fabricante (de preferência fusível gL/gG), com indicação de fim de vida visível; na ligação em paralelo, ligar o contato de sinalização remota, pois a atuação da retaguarda tira o DPS de serviço sem desligar a instalação.</w:t>
+      </w:r>
+    </w:p>
+    <w:p>
+      <w:pPr>
+        <w:pStyle w:val="ListParagraph"/>
+        <w:numPr>
+          <w:ilvl w:val="0"/>
+          <w:numId w:val="1"/>
+        </w:numPr>
+        <w:spacing w:after="40"/>
+      </w:pPr>
+      <w:r>
+        <w:rPr>
+          <w:sz w:val="19"/>
+          <w:szCs w:val="19"/>
+          <w:rFonts w:ascii="Calibri" w:cs="Calibri" w:eastAsia="Calibri" w:hAnsi="Calibri"/>
+        </w:rPr>
+        <w:t xml:space="preserve">Interligar o barramento PE dos quadros ao BEP; com SPDA, ligar o DPS de entrada ao BEP pelo caminho mais curto. Equipotencializar no BEP todas as linhas e tubulações metálicas que entram na edificação.</w:t>
+      </w:r>
+    </w:p>
+    <w:p>
+      <w:pPr>
+        <w:pStyle w:val="ListParagraph"/>
+        <w:numPr>
+          <w:ilvl w:val="0"/>
+          <w:numId w:val="1"/>
+        </w:numPr>
+        <w:spacing w:after="40"/>
+      </w:pPr>
+      <w:r>
+        <w:rPr>
+          <w:sz w:val="19"/>
+          <w:szCs w:val="19"/>
+          <w:rFonts w:ascii="Calibri" w:cs="Calibri" w:eastAsia="Calibri" w:hAnsi="Calibri"/>
+        </w:rPr>
+        <w:t xml:space="preserve">Inspecionar os DPS periodicamente e após descargas atmosféricas na região, substituindo os módulos sinalizados.</w:t>
+      </w:r>
+    </w:p>
+    <w:p>
+      <w:pPr>
+        <w:pStyle w:val="Heading1"/>
+        <w:keepNext/>
+        <w:pBdr>
+          <w:bottom w:val="single" w:color="B9C3CB" w:sz="4"/>
+        </w:pBdr>
+        <w:spacing w:before="320" w:after="140"/>
+      </w:pPr>
+      <w:r>
+        <w:rPr>
+          <w:b/>
+          <w:bCs/>
+          <w:color w:val="0B5A70"/>
+          <w:sz w:val="26"/>
+          <w:szCs w:val="26"/>
+          <w:rFonts w:ascii="Calibri" w:cs="Calibri" w:eastAsia="Calibri" w:hAnsi="Calibri"/>
+        </w:rPr>
+        <w:t xml:space="preserve">12. CONCLUSÃO</w:t>
       </w:r>
     </w:p>
     <w:p>

</xml_diff>